<commit_message>
feat: profile overhaul, bulletin system optimization, and template update
- Implemented profile management with avatar compression and Base64 storage
- Optimized bulletin status logic and updated Word template
- Fixed verifyUser ID overwrite bug and redirection flashing issues
- Unified UI notifications with auto-fading banners
- Updated project documentation and changelog
</commit_message>
<xml_diff>
--- a/public/templates/bulletin-template.docx
+++ b/public/templates/bulletin-template.docx
@@ -5169,27 +5169,7 @@
                 <w:szCs w:val="32"/>
                 <w:lang w:eastAsia="zh-CN"/>
               </w:rPr>
-              <w:t>1</w:t>
-            </w:r>
-            <w:r>
-              <w:rPr>
-                <w:rFonts w:eastAsia="楷体" w:hint="eastAsia"/>
-                <w:spacing w:val="-23"/>
-                <w:sz w:val="32"/>
-                <w:szCs w:val="32"/>
-                <w:lang w:eastAsia="zh-CN"/>
-              </w:rPr>
               <w:t>0</w:t>
-            </w:r>
-            <w:r>
-              <w:rPr>
-                <w:rFonts w:eastAsia="楷体"/>
-                <w:spacing w:val="-23"/>
-                <w:sz w:val="32"/>
-                <w:szCs w:val="32"/>
-                <w:lang w:eastAsia="zh-CN"/>
-              </w:rPr>
-              <w:t>5</w:t>
             </w:r>
             <w:r>
               <w:rPr>
@@ -5278,7 +5258,7 @@
                 <w:szCs w:val="32"/>
                 <w:lang w:eastAsia="zh-CN"/>
               </w:rPr>
-              <w:t>9</w:t>
+              <w:t>0</w:t>
             </w:r>
             <w:r>
               <w:rPr>
@@ -5374,17 +5354,7 @@
                 <w:szCs w:val="32"/>
                 <w:lang w:eastAsia="zh-CN"/>
               </w:rPr>
-              <w:t>1</w:t>
-            </w:r>
-            <w:r>
-              <w:rPr>
-                <w:rFonts w:eastAsia="楷体"/>
-                <w:spacing w:val="-23"/>
-                <w:sz w:val="32"/>
-                <w:szCs w:val="32"/>
-                <w:lang w:eastAsia="zh-CN"/>
-              </w:rPr>
-              <w:t>2</w:t>
+              <w:t>0</w:t>
             </w:r>
             <w:r>
               <w:rPr>
@@ -5473,17 +5443,7 @@
                 <w:szCs w:val="32"/>
                 <w:lang w:eastAsia="zh-CN"/>
               </w:rPr>
-              <w:t>3</w:t>
-            </w:r>
-            <w:r>
-              <w:rPr>
-                <w:rFonts w:eastAsia="楷体" w:hint="eastAsia"/>
-                <w:spacing w:val="-23"/>
-                <w:sz w:val="32"/>
-                <w:szCs w:val="32"/>
-                <w:lang w:eastAsia="zh-CN"/>
-              </w:rPr>
-              <w:t>6</w:t>
+              <w:t>0</w:t>
             </w:r>
             <w:r>
               <w:rPr>
@@ -5573,13 +5533,13 @@
             </w:pPr>
             <w:r>
               <w:rPr>
-                <w:rFonts w:eastAsia="楷体"/>
+                <w:rFonts w:eastAsia="楷体" w:hint="eastAsia"/>
                 <w:spacing w:val="-23"/>
                 <w:sz w:val="32"/>
                 <w:szCs w:val="32"/>
                 <w:lang w:eastAsia="zh-CN"/>
               </w:rPr>
-              <w:t>24</w:t>
+              <w:t>0</w:t>
             </w:r>
             <w:r>
               <w:rPr>
@@ -5668,7 +5628,7 @@
                 <w:szCs w:val="32"/>
                 <w:lang w:eastAsia="zh-CN"/>
               </w:rPr>
-              <w:t>7</w:t>
+              <w:t>0</w:t>
             </w:r>
             <w:r>
               <w:rPr>
@@ -5764,7 +5724,7 @@
                 <w:szCs w:val="32"/>
                 <w:lang w:eastAsia="zh-CN"/>
               </w:rPr>
-              <w:t>10</w:t>
+              <w:t>0</w:t>
             </w:r>
             <w:r>
               <w:rPr>
@@ -5853,7 +5813,7 @@
                 <w:szCs w:val="32"/>
                 <w:lang w:eastAsia="zh-CN"/>
               </w:rPr>
-              <w:t>5</w:t>
+              <w:t>0</w:t>
             </w:r>
             <w:r>
               <w:rPr>
@@ -5948,17 +5908,7 @@
                 <w:szCs w:val="32"/>
                 <w:lang w:eastAsia="zh-CN"/>
               </w:rPr>
-              <w:t>1</w:t>
-            </w:r>
-            <w:r>
-              <w:rPr>
-                <w:rFonts w:eastAsia="楷体" w:hint="eastAsia"/>
-                <w:spacing w:val="-23"/>
-                <w:sz w:val="32"/>
-                <w:szCs w:val="32"/>
-                <w:lang w:eastAsia="zh-CN"/>
-              </w:rPr>
-              <w:t>3</w:t>
+              <w:t>0</w:t>
             </w:r>
             <w:r>
               <w:rPr>
@@ -6067,7 +6017,7 @@
                 <w:szCs w:val="32"/>
                 <w:lang w:eastAsia="zh-CN"/>
               </w:rPr>
-              <w:t>6</w:t>
+              <w:t>0</w:t>
             </w:r>
             <w:r>
               <w:rPr>
@@ -6162,7 +6112,7 @@
                 <w:szCs w:val="32"/>
                 <w:lang w:eastAsia="zh-CN"/>
               </w:rPr>
-              <w:t>14</w:t>
+              <w:t>0</w:t>
             </w:r>
             <w:r>
               <w:rPr>
@@ -6251,7 +6201,7 @@
                 <w:szCs w:val="32"/>
                 <w:lang w:eastAsia="zh-CN"/>
               </w:rPr>
-              <w:t>10</w:t>
+              <w:t>0</w:t>
             </w:r>
             <w:r>
               <w:rPr>
@@ -6366,7 +6316,7 @@
                 <w:szCs w:val="32"/>
                 <w:lang w:eastAsia="zh-CN"/>
               </w:rPr>
-              <w:t>19</w:t>
+              <w:t>0</w:t>
             </w:r>
             <w:r>
               <w:rPr>
@@ -6560,7 +6510,7 @@
                 <w:szCs w:val="32"/>
                 <w:lang w:eastAsia="zh-CN"/>
               </w:rPr>
-              <w:t xml:space="preserve">    1</w:t>
+              <w:t xml:space="preserve">    </w:t>
             </w:r>
             <w:r>
               <w:rPr>
@@ -6570,7 +6520,7 @@
                 <w:szCs w:val="32"/>
                 <w:lang w:eastAsia="zh-CN"/>
               </w:rPr>
-              <w:t>8</w:t>
+              <w:t>0</w:t>
             </w:r>
             <w:r>
               <w:rPr>
@@ -7002,13 +6952,13 @@
             </w:pPr>
             <w:r>
               <w:rPr>
-                <w:rFonts w:eastAsia="楷体"/>
+                <w:rFonts w:eastAsia="楷体" w:hint="eastAsia"/>
                 <w:spacing w:val="-23"/>
                 <w:sz w:val="32"/>
                 <w:szCs w:val="32"/>
                 <w:lang w:eastAsia="zh-CN"/>
               </w:rPr>
-              <w:t>42</w:t>
+              <w:t>0</w:t>
             </w:r>
             <w:r>
               <w:rPr>
@@ -7112,13 +7062,13 @@
             </w:pPr>
             <w:r>
               <w:rPr>
-                <w:rFonts w:eastAsia="楷体"/>
+                <w:rFonts w:eastAsia="楷体" w:hint="eastAsia"/>
                 <w:spacing w:val="-23"/>
                 <w:sz w:val="32"/>
                 <w:szCs w:val="32"/>
                 <w:lang w:eastAsia="zh-CN"/>
               </w:rPr>
-              <w:t>8</w:t>
+              <w:t>0</w:t>
             </w:r>
             <w:r>
               <w:rPr>
@@ -7215,17 +7165,7 @@
                 <w:szCs w:val="32"/>
                 <w:lang w:eastAsia="zh-CN"/>
               </w:rPr>
-              <w:t>1</w:t>
-            </w:r>
-            <w:r>
-              <w:rPr>
-                <w:rFonts w:eastAsia="楷体"/>
-                <w:spacing w:val="-23"/>
-                <w:sz w:val="32"/>
-                <w:szCs w:val="32"/>
-                <w:lang w:eastAsia="zh-CN"/>
-              </w:rPr>
-              <w:t>4</w:t>
+              <w:t>0</w:t>
             </w:r>
             <w:r>
               <w:rPr>
@@ -7315,17 +7255,7 @@
                 <w:szCs w:val="32"/>
                 <w:lang w:eastAsia="zh-CN"/>
               </w:rPr>
-              <w:t>1</w:t>
-            </w:r>
-            <w:r>
-              <w:rPr>
-                <w:rFonts w:eastAsia="楷体"/>
-                <w:spacing w:val="-23"/>
-                <w:sz w:val="32"/>
-                <w:szCs w:val="32"/>
-                <w:lang w:eastAsia="zh-CN"/>
-              </w:rPr>
-              <w:t>2</w:t>
+              <w:t>0</w:t>
             </w:r>
             <w:r>
               <w:rPr>
@@ -7422,7 +7352,7 @@
                 <w:szCs w:val="32"/>
                 <w:lang w:eastAsia="zh-CN"/>
               </w:rPr>
-              <w:t>10</w:t>
+              <w:t>0</w:t>
             </w:r>
             <w:r>
               <w:rPr>
@@ -7862,7 +7792,7 @@
                 <w:szCs w:val="32"/>
                 <w:lang w:eastAsia="zh-CN"/>
               </w:rPr>
-              <w:t>76</w:t>
+              <w:t>0</w:t>
             </w:r>
             <w:r>
               <w:rPr>
@@ -7962,7 +7892,7 @@
                 <w:szCs w:val="32"/>
                 <w:lang w:eastAsia="zh-CN"/>
               </w:rPr>
-              <w:t>9</w:t>
+              <w:t>0</w:t>
             </w:r>
             <w:r>
               <w:rPr>
@@ -8058,7 +7988,7 @@
                 <w:szCs w:val="32"/>
                 <w:lang w:eastAsia="zh-CN"/>
               </w:rPr>
-              <w:t>50</w:t>
+              <w:t>0</w:t>
             </w:r>
             <w:r>
               <w:rPr>
@@ -8148,7 +8078,7 @@
                 <w:szCs w:val="32"/>
                 <w:lang w:eastAsia="zh-CN"/>
               </w:rPr>
-              <w:t>9</w:t>
+              <w:t>0</w:t>
             </w:r>
             <w:r>
               <w:rPr>
@@ -8243,17 +8173,7 @@
                 <w:szCs w:val="32"/>
                 <w:lang w:eastAsia="zh-CN"/>
               </w:rPr>
-              <w:t>1</w:t>
-            </w:r>
-            <w:r>
-              <w:rPr>
-                <w:rFonts w:eastAsia="楷体" w:hint="eastAsia"/>
-                <w:spacing w:val="-23"/>
-                <w:sz w:val="32"/>
-                <w:szCs w:val="32"/>
-                <w:lang w:eastAsia="zh-CN"/>
-              </w:rPr>
-              <w:t>6</w:t>
+              <w:t>0</w:t>
             </w:r>
             <w:r>
               <w:rPr>
@@ -8343,7 +8263,7 @@
                 <w:szCs w:val="32"/>
                 <w:lang w:eastAsia="zh-CN"/>
               </w:rPr>
-              <w:t>10</w:t>
+              <w:t>0</w:t>
             </w:r>
             <w:r>
               <w:rPr>
@@ -8439,7 +8359,7 @@
                 <w:szCs w:val="32"/>
                 <w:lang w:eastAsia="zh-CN"/>
               </w:rPr>
-              <w:t>4</w:t>
+              <w:t>0</w:t>
             </w:r>
             <w:r>
               <w:rPr>
@@ -8529,7 +8449,7 @@
                 <w:szCs w:val="32"/>
                 <w:lang w:eastAsia="zh-CN"/>
               </w:rPr>
-              <w:t>7</w:t>
+              <w:t>0</w:t>
             </w:r>
             <w:r>
               <w:rPr>
@@ -8625,7 +8545,7 @@
                 <w:szCs w:val="32"/>
                 <w:lang w:eastAsia="zh-CN"/>
               </w:rPr>
-              <w:t>10</w:t>
+              <w:t>0</w:t>
             </w:r>
             <w:r>
               <w:rPr>
@@ -8715,7 +8635,7 @@
                 <w:szCs w:val="32"/>
                 <w:lang w:eastAsia="zh-CN"/>
               </w:rPr>
-              <w:t>3</w:t>
+              <w:t>0</w:t>
             </w:r>
             <w:r>
               <w:rPr>
@@ -8821,7 +8741,7 @@
                 <w:szCs w:val="32"/>
                 <w:lang w:eastAsia="zh-CN"/>
               </w:rPr>
-              <w:t>10</w:t>
+              <w:t>0</w:t>
             </w:r>
             <w:r>
               <w:rPr>
@@ -8911,7 +8831,7 @@
                 <w:szCs w:val="32"/>
                 <w:lang w:eastAsia="zh-CN"/>
               </w:rPr>
-              <w:t>9</w:t>
+              <w:t>0</w:t>
             </w:r>
             <w:r>
               <w:rPr>
@@ -13851,7 +13771,7 @@
               <w:spacing w:after="0" w:line="240" w:lineRule="auto"/>
               <w:jc w:val="center"/>
               <w:rPr>
-                <w:rFonts w:eastAsia="楷体"/>
+                <w:rFonts w:eastAsia="楷体" w:hint="eastAsia"/>
                 <w:b/>
                 <w:bCs/>
                 <w:color w:val="000000"/>
@@ -13860,7 +13780,26 @@
                 <w:lang w:eastAsia="zh-CN"/>
               </w:rPr>
             </w:pPr>
-            <w:r>
+          </w:p>
+        </w:tc>
+        <w:tc>
+          <w:tcPr>
+            <w:tcW w:w="1986" w:type="dxa"/>
+            <w:tcBorders>
+              <w:top w:val="single" w:sz="8" w:space="0" w:color="000000"/>
+              <w:left w:val="single" w:sz="8" w:space="0" w:color="000000"/>
+              <w:bottom w:val="single" w:sz="8" w:space="0" w:color="000000"/>
+              <w:right w:val="single" w:sz="8" w:space="0" w:color="000000"/>
+              <w:tl2br w:val="nil"/>
+              <w:tr2bl w:val="nil"/>
+            </w:tcBorders>
+            <w:shd w:val="clear" w:color="auto" w:fill="FFFFFF"/>
+            <w:vAlign w:val="center"/>
+          </w:tcPr>
+          <w:p>
+            <w:pPr>
+              <w:spacing w:after="0" w:line="240" w:lineRule="auto"/>
+              <w:jc w:val="center"/>
               <w:rPr>
                 <w:rFonts w:eastAsia="楷体"/>
                 <w:b/>
@@ -13870,9 +13809,28 @@
                 <w:szCs w:val="28"/>
                 <w:lang w:eastAsia="zh-CN"/>
               </w:rPr>
-              <w:t>3</w:t>
-            </w:r>
-            <w:r>
+            </w:pPr>
+          </w:p>
+        </w:tc>
+        <w:tc>
+          <w:tcPr>
+            <w:tcW w:w="1985" w:type="dxa"/>
+            <w:gridSpan w:val="2"/>
+            <w:tcBorders>
+              <w:top w:val="single" w:sz="8" w:space="0" w:color="000000"/>
+              <w:left w:val="single" w:sz="8" w:space="0" w:color="000000"/>
+              <w:bottom w:val="single" w:sz="8" w:space="0" w:color="000000"/>
+              <w:right w:val="single" w:sz="8" w:space="0" w:color="000000"/>
+              <w:tl2br w:val="nil"/>
+              <w:tr2bl w:val="nil"/>
+            </w:tcBorders>
+            <w:shd w:val="clear" w:color="auto" w:fill="FFFFFF"/>
+            <w:vAlign w:val="center"/>
+          </w:tcPr>
+          <w:p>
+            <w:pPr>
+              <w:spacing w:after="0" w:line="240" w:lineRule="auto"/>
+              <w:jc w:val="center"/>
               <w:rPr>
                 <w:rFonts w:eastAsia="楷体"/>
                 <w:b/>
@@ -13882,9 +13840,27 @@
                 <w:szCs w:val="28"/>
                 <w:lang w:eastAsia="zh-CN"/>
               </w:rPr>
-              <w:t>月</w:t>
-            </w:r>
-            <w:r>
+            </w:pPr>
+          </w:p>
+        </w:tc>
+        <w:tc>
+          <w:tcPr>
+            <w:tcW w:w="2268" w:type="dxa"/>
+            <w:tcBorders>
+              <w:top w:val="single" w:sz="8" w:space="0" w:color="000000"/>
+              <w:left w:val="single" w:sz="8" w:space="0" w:color="000000"/>
+              <w:bottom w:val="single" w:sz="8" w:space="0" w:color="000000"/>
+              <w:right w:val="single" w:sz="8" w:space="0" w:color="000000"/>
+              <w:tl2br w:val="nil"/>
+              <w:tr2bl w:val="nil"/>
+            </w:tcBorders>
+            <w:shd w:val="clear" w:color="auto" w:fill="FFFFFF"/>
+            <w:vAlign w:val="center"/>
+          </w:tcPr>
+          <w:p>
+            <w:pPr>
+              <w:spacing w:after="0" w:line="240" w:lineRule="auto"/>
+              <w:jc w:val="center"/>
               <w:rPr>
                 <w:rFonts w:eastAsia="楷体"/>
                 <w:b/>
@@ -13894,255 +13870,7 @@
                 <w:szCs w:val="28"/>
                 <w:lang w:eastAsia="zh-CN"/>
               </w:rPr>
-              <w:t>8</w:t>
-            </w:r>
-            <w:r>
-              <w:rPr>
-                <w:rFonts w:eastAsia="楷体"/>
-                <w:b/>
-                <w:bCs/>
-                <w:color w:val="000000"/>
-                <w:sz w:val="28"/>
-                <w:szCs w:val="28"/>
-                <w:lang w:eastAsia="zh-CN"/>
-              </w:rPr>
-              <w:t>日</w:t>
-            </w:r>
-          </w:p>
-        </w:tc>
-        <w:tc>
-          <w:tcPr>
-            <w:tcW w:w="1986" w:type="dxa"/>
-            <w:tcBorders>
-              <w:top w:val="single" w:sz="8" w:space="0" w:color="000000"/>
-              <w:left w:val="single" w:sz="8" w:space="0" w:color="000000"/>
-              <w:bottom w:val="single" w:sz="8" w:space="0" w:color="000000"/>
-              <w:right w:val="single" w:sz="8" w:space="0" w:color="000000"/>
-              <w:tl2br w:val="nil"/>
-              <w:tr2bl w:val="nil"/>
-            </w:tcBorders>
-            <w:shd w:val="clear" w:color="auto" w:fill="FFFFFF"/>
-            <w:vAlign w:val="center"/>
-          </w:tcPr>
-          <w:p>
-            <w:pPr>
-              <w:spacing w:after="0" w:line="240" w:lineRule="auto"/>
-              <w:jc w:val="center"/>
-              <w:rPr>
-                <w:rFonts w:eastAsia="楷体"/>
-                <w:b/>
-                <w:bCs/>
-                <w:color w:val="000000"/>
-                <w:sz w:val="28"/>
-                <w:szCs w:val="28"/>
-                <w:lang w:eastAsia="zh-CN"/>
-              </w:rPr>
-            </w:pPr>
-            <w:r>
-              <w:rPr>
-                <w:rFonts w:eastAsia="楷体"/>
-                <w:b/>
-                <w:bCs/>
-                <w:color w:val="000000"/>
-                <w:sz w:val="28"/>
-                <w:szCs w:val="28"/>
-                <w:lang w:eastAsia="zh-CN"/>
-              </w:rPr>
-              <w:t>3</w:t>
-            </w:r>
-            <w:r>
-              <w:rPr>
-                <w:rFonts w:eastAsia="楷体"/>
-                <w:b/>
-                <w:bCs/>
-                <w:color w:val="000000"/>
-                <w:sz w:val="28"/>
-                <w:szCs w:val="28"/>
-                <w:lang w:eastAsia="zh-CN"/>
-              </w:rPr>
-              <w:t>月</w:t>
-            </w:r>
-            <w:r>
-              <w:rPr>
-                <w:rFonts w:eastAsia="楷体"/>
-                <w:b/>
-                <w:bCs/>
-                <w:color w:val="000000"/>
-                <w:sz w:val="28"/>
-                <w:szCs w:val="28"/>
-                <w:lang w:eastAsia="zh-CN"/>
-              </w:rPr>
-              <w:t>15</w:t>
-            </w:r>
-            <w:r>
-              <w:rPr>
-                <w:rFonts w:eastAsia="楷体"/>
-                <w:b/>
-                <w:bCs/>
-                <w:color w:val="000000"/>
-                <w:sz w:val="28"/>
-                <w:szCs w:val="28"/>
-                <w:lang w:eastAsia="zh-CN"/>
-              </w:rPr>
-              <w:t>日</w:t>
-            </w:r>
-          </w:p>
-        </w:tc>
-        <w:tc>
-          <w:tcPr>
-            <w:tcW w:w="1985" w:type="dxa"/>
-            <w:gridSpan w:val="2"/>
-            <w:tcBorders>
-              <w:top w:val="single" w:sz="8" w:space="0" w:color="000000"/>
-              <w:left w:val="single" w:sz="8" w:space="0" w:color="000000"/>
-              <w:bottom w:val="single" w:sz="8" w:space="0" w:color="000000"/>
-              <w:right w:val="single" w:sz="8" w:space="0" w:color="000000"/>
-              <w:tl2br w:val="nil"/>
-              <w:tr2bl w:val="nil"/>
-            </w:tcBorders>
-            <w:shd w:val="clear" w:color="auto" w:fill="FFFFFF"/>
-            <w:vAlign w:val="center"/>
-          </w:tcPr>
-          <w:p>
-            <w:pPr>
-              <w:spacing w:after="0" w:line="240" w:lineRule="auto"/>
-              <w:jc w:val="center"/>
-              <w:rPr>
-                <w:rFonts w:eastAsia="楷体"/>
-                <w:b/>
-                <w:bCs/>
-                <w:color w:val="000000"/>
-                <w:sz w:val="28"/>
-                <w:szCs w:val="28"/>
-                <w:lang w:eastAsia="zh-CN"/>
-              </w:rPr>
-            </w:pPr>
-            <w:r>
-              <w:rPr>
-                <w:rFonts w:eastAsia="楷体"/>
-                <w:b/>
-                <w:bCs/>
-                <w:color w:val="000000"/>
-                <w:sz w:val="28"/>
-                <w:szCs w:val="28"/>
-                <w:lang w:eastAsia="zh-CN"/>
-              </w:rPr>
-              <w:t>3</w:t>
-            </w:r>
-            <w:r>
-              <w:rPr>
-                <w:rFonts w:eastAsia="楷体"/>
-                <w:b/>
-                <w:bCs/>
-                <w:color w:val="000000"/>
-                <w:sz w:val="28"/>
-                <w:szCs w:val="28"/>
-                <w:lang w:eastAsia="zh-CN"/>
-              </w:rPr>
-              <w:t>月</w:t>
-            </w:r>
-            <w:r>
-              <w:rPr>
-                <w:rFonts w:eastAsia="楷体"/>
-                <w:b/>
-                <w:bCs/>
-                <w:color w:val="000000"/>
-                <w:sz w:val="28"/>
-                <w:szCs w:val="28"/>
-                <w:lang w:eastAsia="zh-CN"/>
-              </w:rPr>
-              <w:t>22</w:t>
-            </w:r>
-            <w:r>
-              <w:rPr>
-                <w:rFonts w:eastAsia="楷体"/>
-                <w:b/>
-                <w:bCs/>
-                <w:color w:val="000000"/>
-                <w:sz w:val="28"/>
-                <w:szCs w:val="28"/>
-                <w:lang w:eastAsia="zh-CN"/>
-              </w:rPr>
-              <w:t>日</w:t>
-            </w:r>
-          </w:p>
-        </w:tc>
-        <w:tc>
-          <w:tcPr>
-            <w:tcW w:w="2268" w:type="dxa"/>
-            <w:tcBorders>
-              <w:top w:val="single" w:sz="8" w:space="0" w:color="000000"/>
-              <w:left w:val="single" w:sz="8" w:space="0" w:color="000000"/>
-              <w:bottom w:val="single" w:sz="8" w:space="0" w:color="000000"/>
-              <w:right w:val="single" w:sz="8" w:space="0" w:color="000000"/>
-              <w:tl2br w:val="nil"/>
-              <w:tr2bl w:val="nil"/>
-            </w:tcBorders>
-            <w:shd w:val="clear" w:color="auto" w:fill="FFFFFF"/>
-            <w:vAlign w:val="center"/>
-          </w:tcPr>
-          <w:p>
-            <w:pPr>
-              <w:spacing w:after="0" w:line="240" w:lineRule="auto"/>
-              <w:jc w:val="center"/>
-              <w:rPr>
-                <w:rFonts w:eastAsia="楷体"/>
-                <w:b/>
-                <w:bCs/>
-                <w:color w:val="000000"/>
-                <w:sz w:val="28"/>
-                <w:szCs w:val="28"/>
-                <w:lang w:eastAsia="zh-CN"/>
-              </w:rPr>
-            </w:pPr>
-            <w:r>
-              <w:rPr>
-                <w:rFonts w:eastAsia="楷体"/>
-                <w:b/>
-                <w:bCs/>
-                <w:color w:val="000000"/>
-                <w:sz w:val="28"/>
-                <w:szCs w:val="28"/>
-                <w:lang w:eastAsia="zh-CN"/>
-              </w:rPr>
-              <w:t>3</w:t>
-            </w:r>
-            <w:r>
-              <w:rPr>
-                <w:rFonts w:eastAsia="楷体"/>
-                <w:b/>
-                <w:bCs/>
-                <w:color w:val="000000"/>
-                <w:sz w:val="28"/>
-                <w:szCs w:val="28"/>
-                <w:lang w:eastAsia="zh-CN"/>
-              </w:rPr>
-              <w:t>月</w:t>
-            </w:r>
-            <w:r>
-              <w:rPr>
-                <w:rFonts w:eastAsia="楷体"/>
-                <w:b/>
-                <w:bCs/>
-                <w:color w:val="000000"/>
-                <w:sz w:val="28"/>
-                <w:szCs w:val="28"/>
-                <w:lang w:eastAsia="zh-CN"/>
-              </w:rPr>
-              <w:t>29</w:t>
-            </w:r>
-            <w:r>
-              <w:rPr>
-                <w:rFonts w:eastAsia="楷体"/>
-                <w:b/>
-                <w:bCs/>
-                <w:color w:val="000000"/>
-                <w:sz w:val="28"/>
-                <w:szCs w:val="28"/>
-                <w:lang w:eastAsia="zh-CN"/>
-              </w:rPr>
-              <w:t>日</w:t>
-            </w:r>
+            </w:pPr>
           </w:p>
         </w:tc>
       </w:tr>
@@ -14226,16 +13954,6 @@
                 <w:lang w:eastAsia="zh-TW"/>
               </w:rPr>
             </w:pPr>
-            <w:r>
-              <w:rPr>
-                <w:rFonts w:ascii="楷体" w:eastAsia="楷体" w:hAnsi="楷体" w:hint="eastAsia"/>
-                <w:color w:val="000000"/>
-                <w:sz w:val="28"/>
-                <w:szCs w:val="28"/>
-                <w:lang w:eastAsia="zh-TW"/>
-              </w:rPr>
-              <w:t>張約翰老師</w:t>
-            </w:r>
           </w:p>
         </w:tc>
         <w:tc>
@@ -14264,15 +13982,6 @@
                 <w:lang w:eastAsia="zh-TW"/>
               </w:rPr>
             </w:pPr>
-            <w:r>
-              <w:rPr>
-                <w:rFonts w:ascii="楷体" w:eastAsia="楷体" w:hAnsi="楷体" w:cs="微软雅黑" w:hint="eastAsia"/>
-                <w:spacing w:val="-5"/>
-                <w:sz w:val="28"/>
-                <w:szCs w:val="28"/>
-              </w:rPr>
-              <w:t>龔偉鴻牧師</w:t>
-            </w:r>
           </w:p>
         </w:tc>
         <w:tc>
@@ -14302,25 +14011,6 @@
                 <w:lang w:eastAsia="zh-TW"/>
               </w:rPr>
             </w:pPr>
-            <w:r>
-              <w:rPr>
-                <w:rFonts w:ascii="楷体" w:eastAsia="楷体" w:hAnsi="楷体" w:cs="微软雅黑" w:hint="eastAsia"/>
-                <w:spacing w:val="-5"/>
-                <w:sz w:val="28"/>
-                <w:szCs w:val="28"/>
-                <w:lang w:eastAsia="zh-CN"/>
-              </w:rPr>
-              <w:t>廖旭方</w:t>
-            </w:r>
-            <w:r>
-              <w:rPr>
-                <w:rFonts w:ascii="楷体" w:eastAsia="楷体" w:hAnsi="楷体" w:cs="微软雅黑" w:hint="eastAsia"/>
-                <w:spacing w:val="-5"/>
-                <w:sz w:val="28"/>
-                <w:szCs w:val="28"/>
-              </w:rPr>
-              <w:t>牧師</w:t>
-            </w:r>
           </w:p>
         </w:tc>
         <w:tc>
@@ -14348,15 +14038,6 @@
                 <w:lang w:eastAsia="zh-TW"/>
               </w:rPr>
             </w:pPr>
-            <w:r>
-              <w:rPr>
-                <w:rFonts w:ascii="楷体" w:eastAsia="楷体" w:hAnsi="楷体" w:cs="宋体" w:hint="eastAsia"/>
-                <w:sz w:val="28"/>
-                <w:szCs w:val="28"/>
-                <w:lang w:eastAsia="zh-TW"/>
-              </w:rPr>
-              <w:t>龔偉鴻牧師</w:t>
-            </w:r>
           </w:p>
         </w:tc>
       </w:tr>
@@ -14440,26 +14121,6 @@
                 <w:lang w:eastAsia="zh-TW"/>
               </w:rPr>
             </w:pPr>
-            <w:r>
-              <w:rPr>
-                <w:rFonts w:ascii="楷体" w:eastAsia="楷体" w:hAnsi="楷体" w:hint="eastAsia"/>
-                <w:color w:val="000000"/>
-                <w:sz w:val="28"/>
-                <w:szCs w:val="28"/>
-                <w:lang w:eastAsia="zh-CN"/>
-              </w:rPr>
-              <w:t>謝</w:t>
-            </w:r>
-            <w:r>
-              <w:rPr>
-                <w:rFonts w:ascii="楷体" w:eastAsia="楷体" w:hAnsi="楷体" w:hint="eastAsia"/>
-                <w:color w:val="000000"/>
-                <w:sz w:val="28"/>
-                <w:szCs w:val="28"/>
-                <w:lang w:eastAsia="zh-CN"/>
-              </w:rPr>
-              <w:t>定康</w:t>
-            </w:r>
           </w:p>
         </w:tc>
         <w:tc>
@@ -14488,26 +14149,6 @@
                 <w:lang w:eastAsia="zh-TW"/>
               </w:rPr>
             </w:pPr>
-            <w:r>
-              <w:rPr>
-                <w:rFonts w:ascii="楷体" w:eastAsia="楷体" w:hAnsi="楷体" w:hint="eastAsia"/>
-                <w:color w:val="000000"/>
-                <w:sz w:val="28"/>
-                <w:szCs w:val="28"/>
-                <w:lang w:eastAsia="zh-CN"/>
-              </w:rPr>
-              <w:t>胡世</w:t>
-            </w:r>
-            <w:r>
-              <w:rPr>
-                <w:rFonts w:ascii="楷体" w:eastAsia="楷体" w:hAnsi="楷体" w:hint="eastAsia"/>
-                <w:color w:val="000000"/>
-                <w:sz w:val="28"/>
-                <w:szCs w:val="28"/>
-                <w:lang w:eastAsia="zh-CN"/>
-              </w:rPr>
-              <w:t>樺</w:t>
-            </w:r>
           </w:p>
         </w:tc>
         <w:tc>
@@ -14537,16 +14178,6 @@
                 <w:lang w:eastAsia="zh-CN"/>
               </w:rPr>
             </w:pPr>
-            <w:r>
-              <w:rPr>
-                <w:rFonts w:ascii="楷体" w:eastAsia="楷体" w:hAnsi="楷体" w:cs="微软雅黑" w:hint="eastAsia"/>
-                <w:spacing w:val="-3"/>
-                <w:sz w:val="28"/>
-                <w:szCs w:val="28"/>
-                <w:lang w:eastAsia="zh-CN"/>
-              </w:rPr>
-              <w:t>鍾學謙</w:t>
-            </w:r>
           </w:p>
         </w:tc>
         <w:tc>
@@ -14575,26 +14206,6 @@
                 <w:lang w:eastAsia="zh-TW"/>
               </w:rPr>
             </w:pPr>
-            <w:r>
-              <w:rPr>
-                <w:rFonts w:eastAsia="楷体"/>
-                <w:color w:val="000000"/>
-                <w:sz w:val="28"/>
-                <w:szCs w:val="28"/>
-                <w:lang w:eastAsia="zh-CN"/>
-              </w:rPr>
-              <w:t>Sam</w:t>
-            </w:r>
-            <w:r>
-              <w:rPr>
-                <w:rFonts w:ascii="楷体" w:eastAsia="楷体" w:hAnsi="楷体" w:hint="eastAsia"/>
-                <w:color w:val="000000"/>
-                <w:sz w:val="28"/>
-                <w:szCs w:val="28"/>
-                <w:lang w:eastAsia="zh-TW"/>
-              </w:rPr>
-              <w:t>宿</w:t>
-            </w:r>
           </w:p>
         </w:tc>
       </w:tr>
@@ -14675,64 +14286,9 @@
                 <w:color w:val="000000"/>
                 <w:sz w:val="28"/>
                 <w:szCs w:val="28"/>
-                <w:lang w:eastAsia="zh-CN"/>
-              </w:rPr>
-            </w:pPr>
-            <w:r>
-              <w:rPr>
-                <w:rFonts w:eastAsia="楷体"/>
-                <w:color w:val="000000"/>
-                <w:sz w:val="28"/>
-                <w:szCs w:val="28"/>
-                <w:lang w:eastAsia="zh-CN"/>
-              </w:rPr>
-              <w:t>易芸百</w:t>
-            </w:r>
-          </w:p>
-          <w:p>
-            <w:pPr>
-              <w:spacing w:after="0" w:line="240" w:lineRule="auto"/>
-              <w:jc w:val="center"/>
-              <w:rPr>
-                <w:rFonts w:eastAsia="楷体"/>
-                <w:color w:val="000000"/>
-                <w:sz w:val="28"/>
-                <w:szCs w:val="28"/>
-                <w:lang w:eastAsia="zh-CN"/>
-              </w:rPr>
-            </w:pPr>
-            <w:r>
-              <w:rPr>
-                <w:rFonts w:eastAsia="楷体"/>
-                <w:color w:val="000000"/>
-                <w:sz w:val="28"/>
-                <w:szCs w:val="28"/>
-                <w:lang w:eastAsia="zh-CN"/>
-              </w:rPr>
-              <w:t>孫怡</w:t>
-            </w:r>
-          </w:p>
-          <w:p>
-            <w:pPr>
-              <w:spacing w:after="0" w:line="240" w:lineRule="auto"/>
-              <w:jc w:val="center"/>
-              <w:rPr>
-                <w:rFonts w:eastAsia="楷体"/>
-                <w:color w:val="000000"/>
-                <w:sz w:val="28"/>
-                <w:szCs w:val="28"/>
-                <w:lang w:eastAsia="zh-TW"/>
-              </w:rPr>
-            </w:pPr>
-            <w:r>
-              <w:rPr>
-                <w:rFonts w:eastAsia="楷体"/>
-                <w:sz w:val="28"/>
-                <w:szCs w:val="28"/>
-                <w:lang w:eastAsia="zh-CN"/>
-              </w:rPr>
-              <w:t>Ellen</w:t>
-            </w:r>
+                <w:lang w:eastAsia="zh-TW"/>
+              </w:rPr>
+            </w:pPr>
           </w:p>
         </w:tc>
         <w:tc>
@@ -14758,65 +14314,9 @@
                 <w:color w:val="000000"/>
                 <w:sz w:val="28"/>
                 <w:szCs w:val="28"/>
-                <w:lang w:eastAsia="zh-CN"/>
-              </w:rPr>
-            </w:pPr>
-            <w:r>
-              <w:rPr>
-                <w:rFonts w:eastAsia="楷体"/>
-                <w:color w:val="000000"/>
-                <w:sz w:val="28"/>
-                <w:szCs w:val="28"/>
-                <w:lang w:eastAsia="zh-CN"/>
-              </w:rPr>
-              <w:t>黄建嘉</w:t>
-            </w:r>
-          </w:p>
-          <w:p>
-            <w:pPr>
-              <w:spacing w:after="0" w:line="240" w:lineRule="auto"/>
-              <w:jc w:val="center"/>
-              <w:rPr>
-                <w:rFonts w:eastAsia="楷体"/>
-                <w:color w:val="000000"/>
-                <w:sz w:val="28"/>
-                <w:szCs w:val="28"/>
-                <w:lang w:eastAsia="zh-CN"/>
-              </w:rPr>
-            </w:pPr>
-            <w:r>
-              <w:rPr>
-                <w:rFonts w:eastAsia="楷体"/>
-                <w:color w:val="000000"/>
-                <w:sz w:val="28"/>
-                <w:szCs w:val="28"/>
-                <w:lang w:eastAsia="zh-CN"/>
-              </w:rPr>
-              <w:t>姜官芳</w:t>
-            </w:r>
-          </w:p>
-          <w:p>
-            <w:pPr>
-              <w:spacing w:after="0" w:line="240" w:lineRule="auto"/>
-              <w:jc w:val="center"/>
-              <w:rPr>
-                <w:rFonts w:eastAsia="楷体"/>
-                <w:color w:val="000000"/>
-                <w:sz w:val="28"/>
-                <w:szCs w:val="28"/>
-                <w:lang w:eastAsia="zh-TW"/>
-              </w:rPr>
-            </w:pPr>
-            <w:r>
-              <w:rPr>
-                <w:rFonts w:eastAsia="楷体"/>
-                <w:color w:val="000000"/>
-                <w:sz w:val="28"/>
-                <w:szCs w:val="28"/>
-                <w:lang w:eastAsia="zh-CN"/>
-              </w:rPr>
-              <w:t>张湘琼</w:t>
-            </w:r>
+                <w:lang w:eastAsia="zh-TW"/>
+              </w:rPr>
+            </w:pPr>
           </w:p>
         </w:tc>
         <w:tc>
@@ -14840,68 +14340,11 @@
               <w:jc w:val="center"/>
               <w:rPr>
                 <w:rFonts w:eastAsia="楷体"/>
-                <w:color w:val="000000"/>
                 <w:sz w:val="28"/>
                 <w:szCs w:val="28"/>
                 <w:lang w:eastAsia="zh-CN"/>
               </w:rPr>
             </w:pPr>
-            <w:r>
-              <w:rPr>
-                <w:rFonts w:eastAsia="楷体"/>
-                <w:color w:val="000000"/>
-                <w:sz w:val="28"/>
-                <w:szCs w:val="28"/>
-                <w:lang w:eastAsia="zh-CN"/>
-              </w:rPr>
-              <w:t>陈聆燕</w:t>
-            </w:r>
-          </w:p>
-          <w:p>
-            <w:pPr>
-              <w:spacing w:after="0" w:line="240" w:lineRule="auto"/>
-              <w:jc w:val="center"/>
-              <w:rPr>
-                <w:rFonts w:eastAsia="楷体"/>
-                <w:color w:val="000000"/>
-                <w:sz w:val="28"/>
-                <w:szCs w:val="28"/>
-                <w:lang w:eastAsia="zh-CN"/>
-              </w:rPr>
-            </w:pPr>
-            <w:r>
-              <w:rPr>
-                <w:rFonts w:eastAsia="楷体"/>
-                <w:spacing w:val="-4"/>
-                <w:position w:val="-1"/>
-                <w:sz w:val="28"/>
-                <w:szCs w:val="28"/>
-                <w:lang w:eastAsia="zh-CN"/>
-              </w:rPr>
-              <w:t>陶敏</w:t>
-            </w:r>
-          </w:p>
-          <w:p>
-            <w:pPr>
-              <w:spacing w:after="0" w:line="240" w:lineRule="auto"/>
-              <w:jc w:val="center"/>
-              <w:rPr>
-                <w:rFonts w:eastAsia="楷体"/>
-                <w:sz w:val="28"/>
-                <w:szCs w:val="28"/>
-                <w:lang w:eastAsia="zh-CN"/>
-              </w:rPr>
-            </w:pPr>
-            <w:r>
-              <w:rPr>
-                <w:rFonts w:eastAsia="楷体"/>
-                <w:color w:val="000000"/>
-                <w:sz w:val="28"/>
-                <w:szCs w:val="28"/>
-                <w:lang w:eastAsia="zh-CN"/>
-              </w:rPr>
-              <w:t>张艺凡</w:t>
-            </w:r>
           </w:p>
         </w:tc>
         <w:tc>
@@ -14927,65 +14370,9 @@
                 <w:color w:val="000000"/>
                 <w:sz w:val="28"/>
                 <w:szCs w:val="28"/>
-                <w:lang w:eastAsia="zh-TW"/>
-              </w:rPr>
-            </w:pPr>
-            <w:r>
-              <w:rPr>
-                <w:rFonts w:eastAsia="楷体"/>
-                <w:color w:val="000000"/>
-                <w:sz w:val="28"/>
-                <w:szCs w:val="28"/>
-                <w:lang w:eastAsia="zh-TW"/>
-              </w:rPr>
-              <w:t>李珍麗</w:t>
-            </w:r>
-          </w:p>
-          <w:p>
-            <w:pPr>
-              <w:spacing w:after="0" w:line="240" w:lineRule="auto"/>
-              <w:jc w:val="center"/>
-              <w:rPr>
-                <w:rFonts w:eastAsia="楷体"/>
-                <w:color w:val="000000"/>
-                <w:sz w:val="28"/>
-                <w:szCs w:val="28"/>
-                <w:lang w:eastAsia="zh-TW"/>
-              </w:rPr>
-            </w:pPr>
-            <w:r>
-              <w:rPr>
-                <w:rFonts w:eastAsia="楷体"/>
-                <w:color w:val="000000"/>
-                <w:sz w:val="28"/>
-                <w:szCs w:val="28"/>
-                <w:lang w:eastAsia="zh-TW"/>
-              </w:rPr>
-              <w:t>吳翔</w:t>
-            </w:r>
-          </w:p>
-          <w:p>
-            <w:pPr>
-              <w:spacing w:after="0" w:line="240" w:lineRule="auto"/>
-              <w:jc w:val="center"/>
-              <w:rPr>
-                <w:rFonts w:eastAsia="楷体"/>
-                <w:color w:val="000000"/>
-                <w:sz w:val="28"/>
-                <w:szCs w:val="28"/>
-                <w:lang w:eastAsia="zh-CN"/>
-              </w:rPr>
-            </w:pPr>
-            <w:r>
-              <w:rPr>
-                <w:rFonts w:eastAsia="楷体"/>
-                <w:color w:val="000000"/>
-                <w:sz w:val="28"/>
-                <w:szCs w:val="28"/>
-                <w:lang w:eastAsia="zh-TW"/>
-              </w:rPr>
-              <w:t>張修</w:t>
-            </w:r>
+                <w:lang w:eastAsia="zh-CN"/>
+              </w:rPr>
+            </w:pPr>
           </w:p>
         </w:tc>
       </w:tr>
@@ -15066,42 +14453,9 @@
                 <w:color w:val="000000"/>
                 <w:sz w:val="28"/>
                 <w:szCs w:val="28"/>
-                <w:lang w:eastAsia="zh-CN"/>
-              </w:rPr>
-            </w:pPr>
-            <w:r>
-              <w:rPr>
-                <w:rFonts w:eastAsia="楷体"/>
-                <w:color w:val="000000"/>
-                <w:sz w:val="28"/>
-                <w:szCs w:val="28"/>
-                <w:lang w:eastAsia="zh-CN"/>
-              </w:rPr>
-              <w:t>张修</w:t>
-            </w:r>
-          </w:p>
-          <w:p>
-            <w:pPr>
-              <w:spacing w:after="0" w:line="240" w:lineRule="auto"/>
-              <w:jc w:val="center"/>
-              <w:rPr>
-                <w:rFonts w:eastAsia="楷体"/>
-                <w:color w:val="000000"/>
-                <w:sz w:val="28"/>
-                <w:szCs w:val="28"/>
-                <w:lang w:eastAsia="zh-TW"/>
-              </w:rPr>
-            </w:pPr>
-            <w:r>
-              <w:rPr>
-                <w:rFonts w:eastAsia="楷体"/>
-                <w:color w:val="000000"/>
-                <w:sz w:val="28"/>
-                <w:szCs w:val="28"/>
-                <w:lang w:eastAsia="zh-CN"/>
-              </w:rPr>
-              <w:t>王永贞</w:t>
-            </w:r>
+                <w:lang w:eastAsia="zh-TW"/>
+              </w:rPr>
+            </w:pPr>
           </w:p>
         </w:tc>
         <w:tc>
@@ -15127,42 +14481,9 @@
                 <w:color w:val="000000"/>
                 <w:sz w:val="28"/>
                 <w:szCs w:val="28"/>
-                <w:lang w:eastAsia="zh-CN"/>
-              </w:rPr>
-            </w:pPr>
-            <w:r>
-              <w:rPr>
-                <w:rFonts w:eastAsia="楷体"/>
-                <w:color w:val="000000"/>
-                <w:sz w:val="28"/>
-                <w:szCs w:val="28"/>
-                <w:lang w:eastAsia="zh-CN"/>
-              </w:rPr>
-              <w:t>孙怡</w:t>
-            </w:r>
-          </w:p>
-          <w:p>
-            <w:pPr>
-              <w:spacing w:after="0" w:line="240" w:lineRule="auto"/>
-              <w:jc w:val="center"/>
-              <w:rPr>
-                <w:rFonts w:eastAsia="楷体"/>
-                <w:color w:val="000000"/>
-                <w:sz w:val="28"/>
-                <w:szCs w:val="28"/>
-                <w:lang w:eastAsia="zh-TW"/>
-              </w:rPr>
-            </w:pPr>
-            <w:r>
-              <w:rPr>
-                <w:rFonts w:eastAsia="楷体"/>
-                <w:color w:val="000000"/>
-                <w:sz w:val="28"/>
-                <w:szCs w:val="28"/>
-                <w:lang w:eastAsia="zh-CN"/>
-              </w:rPr>
-              <w:t>李小焰</w:t>
-            </w:r>
+                <w:lang w:eastAsia="zh-TW"/>
+              </w:rPr>
+            </w:pPr>
           </w:p>
         </w:tc>
         <w:tc>
@@ -15189,42 +14510,9 @@
                 <w:color w:val="000000"/>
                 <w:sz w:val="28"/>
                 <w:szCs w:val="28"/>
-                <w:lang w:eastAsia="zh-CN"/>
-              </w:rPr>
-            </w:pPr>
-            <w:r>
-              <w:rPr>
-                <w:rFonts w:eastAsia="楷体"/>
-                <w:color w:val="000000"/>
-                <w:sz w:val="28"/>
-                <w:szCs w:val="28"/>
-                <w:lang w:eastAsia="zh-CN"/>
-              </w:rPr>
-              <w:t>何丹丹</w:t>
-            </w:r>
-          </w:p>
-          <w:p>
-            <w:pPr>
-              <w:spacing w:after="0" w:line="240" w:lineRule="auto"/>
-              <w:jc w:val="center"/>
-              <w:rPr>
-                <w:rFonts w:eastAsia="楷体"/>
-                <w:color w:val="000000"/>
-                <w:sz w:val="28"/>
-                <w:szCs w:val="28"/>
-                <w:lang w:eastAsia="zh-TW"/>
-              </w:rPr>
-            </w:pPr>
-            <w:r>
-              <w:rPr>
-                <w:rFonts w:eastAsia="楷体"/>
-                <w:color w:val="000000"/>
-                <w:sz w:val="28"/>
-                <w:szCs w:val="28"/>
-                <w:lang w:eastAsia="zh-CN"/>
-              </w:rPr>
-              <w:t>Ellen</w:t>
-            </w:r>
+                <w:lang w:eastAsia="zh-TW"/>
+              </w:rPr>
+            </w:pPr>
           </w:p>
         </w:tc>
         <w:tc>
@@ -15250,42 +14538,9 @@
                 <w:color w:val="000000"/>
                 <w:sz w:val="28"/>
                 <w:szCs w:val="28"/>
-                <w:lang w:eastAsia="zh-TW"/>
-              </w:rPr>
-            </w:pPr>
-            <w:r>
-              <w:rPr>
-                <w:rFonts w:eastAsia="楷体"/>
-                <w:color w:val="000000"/>
-                <w:sz w:val="28"/>
-                <w:szCs w:val="28"/>
-                <w:lang w:eastAsia="zh-TW"/>
-              </w:rPr>
-              <w:t>杜敬軍</w:t>
-            </w:r>
-          </w:p>
-          <w:p>
-            <w:pPr>
-              <w:spacing w:after="0" w:line="240" w:lineRule="auto"/>
-              <w:jc w:val="center"/>
-              <w:rPr>
-                <w:rFonts w:eastAsia="楷体"/>
-                <w:color w:val="000000"/>
-                <w:sz w:val="28"/>
-                <w:szCs w:val="28"/>
-                <w:lang w:eastAsia="zh-CN"/>
-              </w:rPr>
-            </w:pPr>
-            <w:r>
-              <w:rPr>
-                <w:rFonts w:eastAsia="楷体"/>
-                <w:color w:val="000000"/>
-                <w:sz w:val="28"/>
-                <w:szCs w:val="28"/>
-                <w:lang w:eastAsia="zh-TW"/>
-              </w:rPr>
-              <w:t>張治</w:t>
-            </w:r>
+                <w:lang w:eastAsia="zh-CN"/>
+              </w:rPr>
+            </w:pPr>
           </w:p>
         </w:tc>
       </w:tr>
@@ -15368,35 +14623,6 @@
                 <w:lang w:eastAsia="zh-CN"/>
               </w:rPr>
             </w:pPr>
-            <w:r>
-              <w:rPr>
-                <w:rFonts w:eastAsia="楷体"/>
-                <w:sz w:val="28"/>
-                <w:szCs w:val="28"/>
-              </w:rPr>
-              <w:t>杜敬軍</w:t>
-            </w:r>
-          </w:p>
-          <w:p>
-            <w:pPr>
-              <w:spacing w:after="0" w:line="240" w:lineRule="auto"/>
-              <w:jc w:val="center"/>
-              <w:rPr>
-                <w:rFonts w:eastAsia="楷体"/>
-                <w:sz w:val="28"/>
-                <w:szCs w:val="28"/>
-                <w:lang w:eastAsia="zh-CN"/>
-              </w:rPr>
-            </w:pPr>
-            <w:r>
-              <w:rPr>
-                <w:rFonts w:eastAsia="楷体"/>
-                <w:sz w:val="28"/>
-                <w:szCs w:val="28"/>
-                <w:lang w:eastAsia="zh-CN"/>
-              </w:rPr>
-              <w:t>Ellen</w:t>
-            </w:r>
           </w:p>
         </w:tc>
         <w:tc>
@@ -15419,44 +14645,11 @@
               <w:jc w:val="center"/>
               <w:rPr>
                 <w:rFonts w:eastAsia="楷体"/>
-                <w:color w:val="000000"/>
                 <w:sz w:val="28"/>
                 <w:szCs w:val="28"/>
                 <w:lang w:eastAsia="zh-CN"/>
               </w:rPr>
             </w:pPr>
-            <w:r>
-              <w:rPr>
-                <w:rFonts w:eastAsia="楷体"/>
-                <w:color w:val="000000"/>
-                <w:sz w:val="28"/>
-                <w:szCs w:val="28"/>
-                <w:lang w:eastAsia="zh-CN"/>
-              </w:rPr>
-              <w:t>张湘琼</w:t>
-            </w:r>
-          </w:p>
-          <w:p>
-            <w:pPr>
-              <w:spacing w:after="0" w:line="240" w:lineRule="auto"/>
-              <w:jc w:val="center"/>
-              <w:rPr>
-                <w:rFonts w:eastAsia="楷体"/>
-                <w:sz w:val="28"/>
-                <w:szCs w:val="28"/>
-                <w:lang w:eastAsia="zh-CN"/>
-              </w:rPr>
-            </w:pPr>
-            <w:r>
-              <w:rPr>
-                <w:rFonts w:eastAsia="楷体"/>
-                <w:color w:val="000000"/>
-                <w:sz w:val="28"/>
-                <w:szCs w:val="28"/>
-                <w:lang w:eastAsia="zh-CN"/>
-              </w:rPr>
-              <w:t>李小焰</w:t>
-            </w:r>
           </w:p>
         </w:tc>
         <w:tc>
@@ -15480,42 +14673,12 @@
               <w:jc w:val="center"/>
               <w:rPr>
                 <w:rFonts w:eastAsia="楷体"/>
-                <w:sz w:val="28"/>
-                <w:szCs w:val="28"/>
-                <w:lang w:eastAsia="zh-CN"/>
-              </w:rPr>
-            </w:pPr>
-            <w:r>
-              <w:rPr>
-                <w:rFonts w:eastAsia="楷体"/>
-                <w:sz w:val="28"/>
-                <w:szCs w:val="28"/>
-                <w:lang w:eastAsia="zh-CN"/>
-              </w:rPr>
-              <w:t>Manson</w:t>
-            </w:r>
-          </w:p>
-          <w:p>
-            <w:pPr>
-              <w:spacing w:after="0" w:line="240" w:lineRule="auto"/>
-              <w:jc w:val="center"/>
-              <w:rPr>
-                <w:rFonts w:eastAsia="楷体"/>
                 <w:color w:val="000000"/>
                 <w:sz w:val="28"/>
                 <w:szCs w:val="28"/>
                 <w:lang w:eastAsia="zh-CN"/>
               </w:rPr>
             </w:pPr>
-            <w:r>
-              <w:rPr>
-                <w:rFonts w:eastAsia="楷体"/>
-                <w:sz w:val="28"/>
-                <w:szCs w:val="28"/>
-                <w:lang w:eastAsia="zh-CN"/>
-              </w:rPr>
-              <w:t>祖如霞</w:t>
-            </w:r>
           </w:p>
         </w:tc>
         <w:tc>
@@ -15543,36 +14706,6 @@
                 <w:lang w:eastAsia="zh-TW"/>
               </w:rPr>
             </w:pPr>
-            <w:r>
-              <w:rPr>
-                <w:rFonts w:eastAsia="楷体"/>
-                <w:sz w:val="28"/>
-                <w:szCs w:val="28"/>
-                <w:lang w:eastAsia="zh-CN"/>
-              </w:rPr>
-              <w:t>周蕾</w:t>
-            </w:r>
-          </w:p>
-          <w:p>
-            <w:pPr>
-              <w:spacing w:after="0" w:line="240" w:lineRule="auto"/>
-              <w:jc w:val="center"/>
-              <w:rPr>
-                <w:rFonts w:eastAsia="楷体"/>
-                <w:sz w:val="28"/>
-                <w:szCs w:val="28"/>
-                <w:lang w:eastAsia="zh-TW"/>
-              </w:rPr>
-            </w:pPr>
-            <w:r>
-              <w:rPr>
-                <w:rFonts w:eastAsia="楷体"/>
-                <w:sz w:val="28"/>
-                <w:szCs w:val="28"/>
-                <w:lang w:eastAsia="zh-TW"/>
-              </w:rPr>
-              <w:t>張霁</w:t>
-            </w:r>
           </w:p>
         </w:tc>
       </w:tr>
@@ -15655,14 +14788,6 @@
                 <w:lang w:eastAsia="zh-TW"/>
               </w:rPr>
             </w:pPr>
-            <w:r>
-              <w:rPr>
-                <w:rFonts w:eastAsia="楷体"/>
-                <w:sz w:val="28"/>
-                <w:szCs w:val="28"/>
-              </w:rPr>
-              <w:t>张宝燕</w:t>
-            </w:r>
           </w:p>
         </w:tc>
         <w:tc>
@@ -15689,14 +14814,6 @@
                 <w:lang w:eastAsia="zh-TW"/>
               </w:rPr>
             </w:pPr>
-            <w:r>
-              <w:rPr>
-                <w:rFonts w:eastAsia="楷体"/>
-                <w:sz w:val="28"/>
-                <w:szCs w:val="28"/>
-              </w:rPr>
-              <w:t>张治</w:t>
-            </w:r>
           </w:p>
         </w:tc>
         <w:tc>
@@ -15725,16 +14842,6 @@
                 <w:lang w:eastAsia="zh-CN"/>
               </w:rPr>
             </w:pPr>
-            <w:r>
-              <w:rPr>
-                <w:rFonts w:eastAsia="楷体"/>
-                <w:color w:val="000000"/>
-                <w:sz w:val="28"/>
-                <w:szCs w:val="28"/>
-                <w:lang w:eastAsia="zh-CN"/>
-              </w:rPr>
-              <w:t>张修</w:t>
-            </w:r>
           </w:p>
         </w:tc>
         <w:tc>
@@ -15844,95 +14951,6 @@
                 <w:lang w:eastAsia="zh-CN"/>
               </w:rPr>
             </w:pPr>
-            <w:r>
-              <w:rPr>
-                <w:rFonts w:eastAsia="楷体"/>
-                <w:color w:val="000000"/>
-                <w:sz w:val="28"/>
-                <w:szCs w:val="28"/>
-                <w:lang w:eastAsia="zh-CN"/>
-              </w:rPr>
-              <w:t>陶敏</w:t>
-            </w:r>
-          </w:p>
-          <w:p>
-            <w:pPr>
-              <w:spacing w:after="0" w:line="240" w:lineRule="auto"/>
-              <w:jc w:val="center"/>
-              <w:rPr>
-                <w:rFonts w:eastAsia="楷体"/>
-                <w:color w:val="000000"/>
-                <w:sz w:val="28"/>
-                <w:szCs w:val="28"/>
-                <w:lang w:eastAsia="zh-CN"/>
-              </w:rPr>
-            </w:pPr>
-            <w:r>
-              <w:rPr>
-                <w:rFonts w:eastAsia="楷体"/>
-                <w:color w:val="000000"/>
-                <w:sz w:val="28"/>
-                <w:szCs w:val="28"/>
-                <w:lang w:eastAsia="zh-CN"/>
-              </w:rPr>
-              <w:t>余悦涵</w:t>
-            </w:r>
-          </w:p>
-          <w:p>
-            <w:pPr>
-              <w:spacing w:after="0" w:line="240" w:lineRule="auto"/>
-              <w:jc w:val="center"/>
-              <w:rPr>
-                <w:rFonts w:eastAsia="楷体"/>
-                <w:color w:val="000000"/>
-                <w:sz w:val="28"/>
-                <w:szCs w:val="28"/>
-                <w:lang w:eastAsia="zh-CN"/>
-              </w:rPr>
-            </w:pPr>
-            <w:r>
-              <w:rPr>
-                <w:rFonts w:eastAsia="楷体"/>
-                <w:color w:val="000000"/>
-                <w:sz w:val="28"/>
-                <w:szCs w:val="28"/>
-                <w:lang w:eastAsia="zh-CN"/>
-              </w:rPr>
-              <w:t>张宝燕</w:t>
-            </w:r>
-          </w:p>
-          <w:p>
-            <w:pPr>
-              <w:spacing w:after="0" w:line="240" w:lineRule="auto"/>
-              <w:jc w:val="center"/>
-              <w:rPr>
-                <w:rFonts w:eastAsia="楷体"/>
-                <w:color w:val="000000"/>
-                <w:sz w:val="28"/>
-                <w:szCs w:val="28"/>
-                <w:lang w:eastAsia="zh-CN"/>
-              </w:rPr>
-            </w:pPr>
-            <w:r>
-              <w:rPr>
-                <w:rFonts w:eastAsia="楷体"/>
-                <w:color w:val="000000"/>
-                <w:sz w:val="28"/>
-                <w:szCs w:val="28"/>
-                <w:lang w:eastAsia="zh-CN"/>
-              </w:rPr>
-              <w:t>Tina</w:t>
-            </w:r>
-            <w:r>
-              <w:rPr>
-                <w:rFonts w:eastAsia="楷体"/>
-                <w:color w:val="000000"/>
-                <w:sz w:val="28"/>
-                <w:szCs w:val="28"/>
-                <w:lang w:eastAsia="zh-CN"/>
-              </w:rPr>
-              <w:t>侯</w:t>
-            </w:r>
           </w:p>
         </w:tc>
         <w:tc>
@@ -15960,85 +14978,6 @@
                 <w:lang w:eastAsia="zh-CN"/>
               </w:rPr>
             </w:pPr>
-            <w:r>
-              <w:rPr>
-                <w:rFonts w:eastAsia="楷体"/>
-                <w:color w:val="000000"/>
-                <w:sz w:val="28"/>
-                <w:szCs w:val="28"/>
-                <w:lang w:eastAsia="zh-CN"/>
-              </w:rPr>
-              <w:t>陶敏</w:t>
-            </w:r>
-          </w:p>
-          <w:p>
-            <w:pPr>
-              <w:spacing w:after="0" w:line="240" w:lineRule="auto"/>
-              <w:jc w:val="center"/>
-              <w:rPr>
-                <w:rFonts w:eastAsia="楷体"/>
-                <w:color w:val="000000"/>
-                <w:sz w:val="28"/>
-                <w:szCs w:val="28"/>
-                <w:lang w:eastAsia="zh-CN"/>
-              </w:rPr>
-            </w:pPr>
-            <w:r>
-              <w:rPr>
-                <w:rFonts w:eastAsia="楷体"/>
-                <w:color w:val="000000"/>
-                <w:sz w:val="28"/>
-                <w:szCs w:val="28"/>
-                <w:lang w:eastAsia="zh-CN"/>
-              </w:rPr>
-              <w:t>苏锡安</w:t>
-            </w:r>
-          </w:p>
-          <w:p>
-            <w:pPr>
-              <w:spacing w:after="0" w:line="240" w:lineRule="auto"/>
-              <w:jc w:val="center"/>
-              <w:rPr>
-                <w:rFonts w:eastAsia="楷体"/>
-                <w:color w:val="000000"/>
-                <w:sz w:val="28"/>
-                <w:szCs w:val="28"/>
-                <w:lang w:eastAsia="zh-CN"/>
-              </w:rPr>
-            </w:pPr>
-            <w:r>
-              <w:rPr>
-                <w:rFonts w:eastAsia="楷体"/>
-                <w:color w:val="000000"/>
-                <w:sz w:val="28"/>
-                <w:szCs w:val="28"/>
-                <w:lang w:eastAsia="zh-CN"/>
-              </w:rPr>
-              <w:t>张治</w:t>
-            </w:r>
-          </w:p>
-          <w:p>
-            <w:pPr>
-              <w:spacing w:after="0" w:line="240" w:lineRule="auto"/>
-              <w:jc w:val="center"/>
-              <w:rPr>
-                <w:rFonts w:eastAsia="楷体"/>
-                <w:color w:val="000000"/>
-                <w:sz w:val="28"/>
-                <w:szCs w:val="28"/>
-                <w:lang w:eastAsia="zh-CN"/>
-              </w:rPr>
-            </w:pPr>
-            <w:r>
-              <w:rPr>
-                <w:rFonts w:eastAsia="楷体"/>
-                <w:color w:val="000000"/>
-                <w:sz w:val="28"/>
-                <w:szCs w:val="28"/>
-                <w:lang w:eastAsia="zh-CN"/>
-              </w:rPr>
-              <w:t>程澈</w:t>
-            </w:r>
           </w:p>
         </w:tc>
         <w:tc>
@@ -16067,85 +15006,6 @@
                 <w:lang w:eastAsia="zh-CN"/>
               </w:rPr>
             </w:pPr>
-            <w:r>
-              <w:rPr>
-                <w:rFonts w:eastAsia="楷体"/>
-                <w:color w:val="000000"/>
-                <w:sz w:val="28"/>
-                <w:szCs w:val="28"/>
-                <w:lang w:eastAsia="zh-CN"/>
-              </w:rPr>
-              <w:t>黄怡瑄</w:t>
-            </w:r>
-          </w:p>
-          <w:p>
-            <w:pPr>
-              <w:spacing w:after="0" w:line="240" w:lineRule="auto"/>
-              <w:jc w:val="center"/>
-              <w:rPr>
-                <w:rFonts w:eastAsia="楷体"/>
-                <w:color w:val="000000"/>
-                <w:sz w:val="28"/>
-                <w:szCs w:val="28"/>
-                <w:lang w:eastAsia="zh-CN"/>
-              </w:rPr>
-            </w:pPr>
-            <w:r>
-              <w:rPr>
-                <w:rFonts w:eastAsia="楷体"/>
-                <w:color w:val="000000"/>
-                <w:sz w:val="28"/>
-                <w:szCs w:val="28"/>
-                <w:lang w:eastAsia="zh-CN"/>
-              </w:rPr>
-              <w:t>李惟舟</w:t>
-            </w:r>
-          </w:p>
-          <w:p>
-            <w:pPr>
-              <w:spacing w:after="0" w:line="240" w:lineRule="auto"/>
-              <w:jc w:val="center"/>
-              <w:rPr>
-                <w:rFonts w:eastAsia="楷体"/>
-                <w:color w:val="000000"/>
-                <w:sz w:val="28"/>
-                <w:szCs w:val="28"/>
-                <w:lang w:eastAsia="zh-CN"/>
-              </w:rPr>
-            </w:pPr>
-            <w:r>
-              <w:rPr>
-                <w:rFonts w:eastAsia="楷体"/>
-                <w:color w:val="000000"/>
-                <w:sz w:val="28"/>
-                <w:szCs w:val="28"/>
-                <w:lang w:eastAsia="zh-CN"/>
-              </w:rPr>
-              <w:t>张修</w:t>
-            </w:r>
-          </w:p>
-          <w:p>
-            <w:pPr>
-              <w:spacing w:after="0" w:line="240" w:lineRule="auto"/>
-              <w:jc w:val="center"/>
-              <w:rPr>
-                <w:rFonts w:eastAsia="楷体"/>
-                <w:color w:val="000000"/>
-                <w:sz w:val="28"/>
-                <w:szCs w:val="28"/>
-                <w:lang w:eastAsia="zh-CN"/>
-              </w:rPr>
-            </w:pPr>
-            <w:r>
-              <w:rPr>
-                <w:rFonts w:eastAsia="楷体"/>
-                <w:color w:val="000000"/>
-                <w:sz w:val="28"/>
-                <w:szCs w:val="28"/>
-                <w:lang w:eastAsia="zh-CN"/>
-              </w:rPr>
-              <w:t>周蕾</w:t>
-            </w:r>
           </w:p>
         </w:tc>
         <w:tc>
@@ -16255,16 +15115,6 @@
                 <w:lang w:eastAsia="zh-TW"/>
               </w:rPr>
             </w:pPr>
-            <w:r>
-              <w:rPr>
-                <w:rFonts w:ascii="楷体" w:eastAsia="楷体" w:hAnsi="楷体" w:hint="eastAsia"/>
-                <w:color w:val="000000"/>
-                <w:sz w:val="28"/>
-                <w:szCs w:val="28"/>
-                <w:lang w:eastAsia="zh-CN"/>
-              </w:rPr>
-              <w:t>刘美</w:t>
-            </w:r>
           </w:p>
         </w:tc>
         <w:tc>
@@ -16292,16 +15142,6 @@
                 <w:lang w:eastAsia="zh-CN"/>
               </w:rPr>
             </w:pPr>
-            <w:r>
-              <w:rPr>
-                <w:rFonts w:ascii="楷体" w:eastAsia="楷体" w:hAnsi="楷体" w:cs="微软雅黑" w:hint="eastAsia"/>
-                <w:spacing w:val="-8"/>
-                <w:sz w:val="28"/>
-                <w:szCs w:val="28"/>
-                <w:lang w:eastAsia="zh-CN"/>
-              </w:rPr>
-              <w:t>黄怡瑄</w:t>
-            </w:r>
           </w:p>
         </w:tc>
         <w:tc>
@@ -16330,26 +15170,6 @@
                 <w:lang w:eastAsia="zh-CN"/>
               </w:rPr>
             </w:pPr>
-            <w:r>
-              <w:rPr>
-                <w:rFonts w:ascii="楷体" w:eastAsia="楷体" w:hAnsi="楷体" w:hint="eastAsia"/>
-                <w:color w:val="000000"/>
-                <w:sz w:val="28"/>
-                <w:szCs w:val="28"/>
-                <w:lang w:eastAsia="zh-CN"/>
-              </w:rPr>
-              <w:t>胡世</w:t>
-            </w:r>
-            <w:r>
-              <w:rPr>
-                <w:rFonts w:ascii="楷体" w:eastAsia="楷体" w:hAnsi="楷体" w:hint="eastAsia"/>
-                <w:color w:val="000000"/>
-                <w:sz w:val="28"/>
-                <w:szCs w:val="28"/>
-                <w:lang w:eastAsia="zh-CN"/>
-              </w:rPr>
-              <w:t>樺</w:t>
-            </w:r>
           </w:p>
         </w:tc>
         <w:tc>
@@ -16377,16 +15197,6 @@
                 <w:lang w:eastAsia="zh-TW"/>
               </w:rPr>
             </w:pPr>
-            <w:r>
-              <w:rPr>
-                <w:rFonts w:ascii="楷体" w:eastAsia="楷体" w:hAnsi="楷体" w:cs="微软雅黑" w:hint="eastAsia"/>
-                <w:spacing w:val="-8"/>
-                <w:sz w:val="28"/>
-                <w:szCs w:val="28"/>
-                <w:lang w:eastAsia="zh-CN"/>
-              </w:rPr>
-              <w:t>龔恩璐</w:t>
-            </w:r>
           </w:p>
         </w:tc>
       </w:tr>
@@ -16463,28 +15273,6 @@
               <w:spacing w:after="0" w:line="240" w:lineRule="auto"/>
               <w:jc w:val="center"/>
               <w:rPr>
-                <w:rFonts w:ascii="楷体" w:eastAsia="楷体" w:hAnsi="楷体" w:cs="微软雅黑"/>
-                <w:spacing w:val="-8"/>
-                <w:sz w:val="28"/>
-                <w:szCs w:val="28"/>
-                <w:lang w:eastAsia="zh-CN"/>
-              </w:rPr>
-            </w:pPr>
-            <w:r>
-              <w:rPr>
-                <w:rFonts w:ascii="楷体" w:eastAsia="楷体" w:hAnsi="楷体" w:cs="微软雅黑" w:hint="eastAsia"/>
-                <w:spacing w:val="-8"/>
-                <w:sz w:val="28"/>
-                <w:szCs w:val="28"/>
-              </w:rPr>
-              <w:t>龔恩璐</w:t>
-            </w:r>
-          </w:p>
-          <w:p>
-            <w:pPr>
-              <w:spacing w:after="0" w:line="240" w:lineRule="auto"/>
-              <w:jc w:val="center"/>
-              <w:rPr>
                 <w:rFonts w:ascii="楷体" w:eastAsia="楷体" w:hAnsi="楷体"/>
                 <w:color w:val="000000"/>
                 <w:sz w:val="28"/>
@@ -16492,24 +15280,6 @@
                 <w:lang w:eastAsia="zh-CN"/>
               </w:rPr>
             </w:pPr>
-            <w:r>
-              <w:rPr>
-                <w:rFonts w:eastAsia="楷体"/>
-                <w:spacing w:val="-1"/>
-                <w:sz w:val="28"/>
-                <w:szCs w:val="28"/>
-              </w:rPr>
-              <w:t>Rachel</w:t>
-            </w:r>
-            <w:r>
-              <w:rPr>
-                <w:rFonts w:ascii="楷体" w:eastAsia="楷体" w:hAnsi="楷体" w:cs="微软雅黑" w:hint="eastAsia"/>
-                <w:spacing w:val="-1"/>
-                <w:sz w:val="28"/>
-                <w:szCs w:val="28"/>
-              </w:rPr>
-              <w:t>謝</w:t>
-            </w:r>
           </w:p>
         </w:tc>
         <w:tc>
@@ -16531,28 +15301,6 @@
               <w:spacing w:after="0" w:line="240" w:lineRule="auto"/>
               <w:jc w:val="center"/>
               <w:rPr>
-                <w:rFonts w:ascii="楷体" w:eastAsia="楷体" w:hAnsi="楷体" w:cs="微软雅黑"/>
-                <w:spacing w:val="-8"/>
-                <w:sz w:val="28"/>
-                <w:szCs w:val="28"/>
-                <w:lang w:eastAsia="zh-CN"/>
-              </w:rPr>
-            </w:pPr>
-            <w:r>
-              <w:rPr>
-                <w:rFonts w:ascii="楷体" w:eastAsia="楷体" w:hAnsi="楷体" w:cs="微软雅黑" w:hint="eastAsia"/>
-                <w:spacing w:val="-8"/>
-                <w:sz w:val="28"/>
-                <w:szCs w:val="28"/>
-              </w:rPr>
-              <w:t>龔恩璐</w:t>
-            </w:r>
-          </w:p>
-          <w:p>
-            <w:pPr>
-              <w:spacing w:after="0" w:line="240" w:lineRule="auto"/>
-              <w:jc w:val="center"/>
-              <w:rPr>
                 <w:rFonts w:ascii="楷体" w:eastAsia="楷体" w:hAnsi="楷体"/>
                 <w:color w:val="000000"/>
                 <w:sz w:val="28"/>
@@ -16560,24 +15308,6 @@
                 <w:lang w:eastAsia="zh-CN"/>
               </w:rPr>
             </w:pPr>
-            <w:r>
-              <w:rPr>
-                <w:rFonts w:eastAsia="楷体"/>
-                <w:spacing w:val="-1"/>
-                <w:sz w:val="28"/>
-                <w:szCs w:val="28"/>
-              </w:rPr>
-              <w:t>Rachel</w:t>
-            </w:r>
-            <w:r>
-              <w:rPr>
-                <w:rFonts w:ascii="楷体" w:eastAsia="楷体" w:hAnsi="楷体" w:cs="微软雅黑" w:hint="eastAsia"/>
-                <w:spacing w:val="-1"/>
-                <w:sz w:val="28"/>
-                <w:szCs w:val="28"/>
-              </w:rPr>
-              <w:t>謝</w:t>
-            </w:r>
           </w:p>
         </w:tc>
         <w:tc>
@@ -16600,29 +15330,6 @@
               <w:spacing w:after="0" w:line="240" w:lineRule="auto"/>
               <w:jc w:val="center"/>
               <w:rPr>
-                <w:rFonts w:eastAsia="楷体"/>
-                <w:color w:val="000000"/>
-                <w:sz w:val="28"/>
-                <w:szCs w:val="28"/>
-                <w:lang w:eastAsia="zh-CN"/>
-              </w:rPr>
-            </w:pPr>
-            <w:r>
-              <w:rPr>
-                <w:rFonts w:eastAsia="楷体" w:hint="eastAsia"/>
-                <w:color w:val="000000"/>
-                <w:sz w:val="28"/>
-                <w:szCs w:val="28"/>
-                <w:lang w:eastAsia="zh-CN"/>
-              </w:rPr>
-              <w:t>郭心瑜</w:t>
-            </w:r>
-          </w:p>
-          <w:p>
-            <w:pPr>
-              <w:spacing w:after="0" w:line="240" w:lineRule="auto"/>
-              <w:jc w:val="center"/>
-              <w:rPr>
                 <w:rFonts w:ascii="楷体" w:eastAsia="楷体" w:hAnsi="楷体"/>
                 <w:color w:val="000000"/>
                 <w:sz w:val="28"/>
@@ -16630,16 +15337,6 @@
                 <w:lang w:eastAsia="zh-CN"/>
               </w:rPr>
             </w:pPr>
-            <w:r>
-              <w:rPr>
-                <w:rFonts w:eastAsia="楷体" w:hint="eastAsia"/>
-                <w:color w:val="000000"/>
-                <w:sz w:val="28"/>
-                <w:szCs w:val="28"/>
-                <w:lang w:eastAsia="zh-CN"/>
-              </w:rPr>
-              <w:t>李云龙</w:t>
-            </w:r>
           </w:p>
         </w:tc>
         <w:tc>
@@ -16668,39 +15365,6 @@
                 <w:lang w:eastAsia="zh-TW"/>
               </w:rPr>
             </w:pPr>
-            <w:r>
-              <w:rPr>
-                <w:rFonts w:eastAsia="楷体" w:hint="eastAsia"/>
-                <w:color w:val="000000"/>
-                <w:sz w:val="28"/>
-                <w:szCs w:val="28"/>
-                <w:lang w:eastAsia="zh-TW"/>
-              </w:rPr>
-              <w:t>郭心瑜</w:t>
-            </w:r>
-          </w:p>
-          <w:p>
-            <w:pPr>
-              <w:spacing w:after="0" w:line="240" w:lineRule="auto"/>
-              <w:jc w:val="center"/>
-              <w:rPr>
-                <w:rFonts w:eastAsia="楷体"/>
-                <w:color w:val="000000"/>
-                <w:sz w:val="28"/>
-                <w:szCs w:val="28"/>
-                <w:lang w:eastAsia="zh-TW"/>
-              </w:rPr>
-            </w:pPr>
-            <w:r>
-              <w:rPr>
-                <w:rFonts w:eastAsia="楷体"/>
-                <w:color w:val="000000"/>
-                <w:sz w:val="28"/>
-                <w:szCs w:val="28"/>
-                <w:lang w:eastAsia="zh-TW"/>
-              </w:rPr>
-              <w:t>Rachel</w:t>
-            </w:r>
           </w:p>
         </w:tc>
       </w:tr>
@@ -16777,28 +15441,6 @@
               <w:spacing w:after="0" w:line="240" w:lineRule="auto"/>
               <w:jc w:val="center"/>
               <w:rPr>
-                <w:rFonts w:ascii="楷体" w:eastAsia="楷体" w:hAnsi="楷体" w:cs="微软雅黑"/>
-                <w:spacing w:val="-6"/>
-                <w:sz w:val="28"/>
-                <w:szCs w:val="28"/>
-                <w:lang w:eastAsia="zh-CN"/>
-              </w:rPr>
-            </w:pPr>
-            <w:r>
-              <w:rPr>
-                <w:rFonts w:ascii="楷体" w:eastAsia="楷体" w:hAnsi="楷体" w:cs="微软雅黑" w:hint="eastAsia"/>
-                <w:spacing w:val="-6"/>
-                <w:sz w:val="28"/>
-                <w:szCs w:val="28"/>
-              </w:rPr>
-              <w:t>龔恩喬</w:t>
-            </w:r>
-          </w:p>
-          <w:p>
-            <w:pPr>
-              <w:spacing w:after="0" w:line="240" w:lineRule="auto"/>
-              <w:jc w:val="center"/>
-              <w:rPr>
                 <w:rFonts w:ascii="楷体" w:eastAsia="楷体" w:hAnsi="楷体"/>
                 <w:color w:val="000000"/>
                 <w:sz w:val="28"/>
@@ -16806,28 +15448,6 @@
                 <w:lang w:eastAsia="zh-TW"/>
               </w:rPr>
             </w:pPr>
-            <w:bookmarkStart w:id="7" w:name="OLE_LINK8"/>
-            <w:r>
-              <w:rPr>
-                <w:rFonts w:ascii="楷体" w:eastAsia="楷体" w:hAnsi="楷体" w:cs="微软雅黑" w:hint="eastAsia"/>
-                <w:spacing w:val="-6"/>
-                <w:sz w:val="28"/>
-                <w:szCs w:val="28"/>
-                <w:lang w:eastAsia="zh-CN"/>
-              </w:rPr>
-              <w:t>李</w:t>
-            </w:r>
-            <w:r>
-              <w:rPr>
-                <w:rFonts w:ascii="楷体" w:eastAsia="楷体" w:hAnsi="楷体" w:hint="eastAsia"/>
-                <w:color w:val="000000"/>
-                <w:sz w:val="28"/>
-                <w:szCs w:val="28"/>
-                <w:lang w:eastAsia="zh-CN"/>
-              </w:rPr>
-              <w:t>惟舟</w:t>
-            </w:r>
-            <w:bookmarkEnd w:id="7"/>
           </w:p>
         </w:tc>
         <w:tc>
@@ -16856,15 +15476,6 @@
                 <w:lang w:eastAsia="zh-TW"/>
               </w:rPr>
             </w:pPr>
-            <w:r>
-              <w:rPr>
-                <w:rFonts w:ascii="楷体" w:eastAsia="楷体" w:hAnsi="楷体" w:cs="微软雅黑" w:hint="eastAsia"/>
-                <w:spacing w:val="-6"/>
-                <w:sz w:val="28"/>
-                <w:szCs w:val="28"/>
-              </w:rPr>
-              <w:t>龔恩喬</w:t>
-            </w:r>
           </w:p>
         </w:tc>
         <w:tc>
@@ -16891,20 +15502,25 @@
                 <w:color w:val="000000"/>
                 <w:sz w:val="28"/>
                 <w:szCs w:val="28"/>
-                <w:lang w:eastAsia="zh-CN"/>
-              </w:rPr>
-            </w:pPr>
-            <w:r>
-              <w:rPr>
-                <w:rFonts w:ascii="楷体" w:eastAsia="楷体" w:hAnsi="楷体" w:hint="eastAsia"/>
-                <w:color w:val="000000"/>
-                <w:sz w:val="28"/>
-                <w:szCs w:val="28"/>
-                <w:lang w:eastAsia="zh-CN"/>
-              </w:rPr>
-              <w:t>倪酒鑫</w:t>
-            </w:r>
-          </w:p>
+                <w:lang w:eastAsia="zh-TW"/>
+              </w:rPr>
+            </w:pPr>
+          </w:p>
+        </w:tc>
+        <w:tc>
+          <w:tcPr>
+            <w:tcW w:w="2268" w:type="dxa"/>
+            <w:tcBorders>
+              <w:top w:val="single" w:sz="8" w:space="0" w:color="000000"/>
+              <w:left w:val="single" w:sz="8" w:space="0" w:color="000000"/>
+              <w:bottom w:val="single" w:sz="8" w:space="0" w:color="000000"/>
+              <w:right w:val="single" w:sz="8" w:space="0" w:color="000000"/>
+              <w:tl2br w:val="nil"/>
+              <w:tr2bl w:val="nil"/>
+            </w:tcBorders>
+            <w:shd w:val="clear" w:color="auto" w:fill="FFFFFF"/>
+            <w:vAlign w:val="center"/>
+          </w:tcPr>
           <w:p>
             <w:pPr>
               <w:spacing w:after="0" w:line="240" w:lineRule="auto"/>
@@ -16914,80 +15530,9 @@
                 <w:color w:val="000000"/>
                 <w:sz w:val="28"/>
                 <w:szCs w:val="28"/>
-                <w:lang w:eastAsia="zh-TW"/>
-              </w:rPr>
-            </w:pPr>
-            <w:r>
-              <w:rPr>
-                <w:rFonts w:ascii="楷体" w:eastAsia="楷体" w:hAnsi="楷体" w:hint="eastAsia"/>
-                <w:color w:val="000000"/>
-                <w:sz w:val="28"/>
-                <w:szCs w:val="28"/>
-                <w:lang w:eastAsia="zh-CN"/>
-              </w:rPr>
-              <w:t>李惟舟</w:t>
-            </w:r>
-          </w:p>
-        </w:tc>
-        <w:tc>
-          <w:tcPr>
-            <w:tcW w:w="2268" w:type="dxa"/>
-            <w:tcBorders>
-              <w:top w:val="single" w:sz="8" w:space="0" w:color="000000"/>
-              <w:left w:val="single" w:sz="8" w:space="0" w:color="000000"/>
-              <w:bottom w:val="single" w:sz="8" w:space="0" w:color="000000"/>
-              <w:right w:val="single" w:sz="8" w:space="0" w:color="000000"/>
-              <w:tl2br w:val="nil"/>
-              <w:tr2bl w:val="nil"/>
-            </w:tcBorders>
-            <w:shd w:val="clear" w:color="auto" w:fill="FFFFFF"/>
-            <w:vAlign w:val="center"/>
-          </w:tcPr>
-          <w:p>
-            <w:pPr>
-              <w:spacing w:after="0" w:line="240" w:lineRule="auto"/>
-              <w:jc w:val="center"/>
-              <w:rPr>
-                <w:rFonts w:ascii="楷体" w:eastAsia="楷体" w:hAnsi="楷体"/>
-                <w:color w:val="000000"/>
-                <w:sz w:val="28"/>
-                <w:szCs w:val="28"/>
-                <w:lang w:eastAsia="zh-TW"/>
-              </w:rPr>
-            </w:pPr>
-            <w:r>
-              <w:rPr>
-                <w:rFonts w:ascii="楷体" w:eastAsia="楷体" w:hAnsi="楷体" w:hint="eastAsia"/>
-                <w:color w:val="000000"/>
-                <w:sz w:val="28"/>
-                <w:szCs w:val="28"/>
-                <w:lang w:eastAsia="zh-TW"/>
-              </w:rPr>
-              <w:t>龔恩喬</w:t>
-            </w:r>
-          </w:p>
-          <w:p>
-            <w:pPr>
-              <w:spacing w:after="0" w:line="240" w:lineRule="auto"/>
-              <w:jc w:val="center"/>
-              <w:rPr>
-                <w:rFonts w:ascii="楷体" w:eastAsia="楷体" w:hAnsi="楷体"/>
-                <w:color w:val="000000"/>
-                <w:sz w:val="28"/>
-                <w:szCs w:val="28"/>
-                <w:lang w:eastAsia="zh-CN"/>
-              </w:rPr>
-            </w:pPr>
-            <w:r>
-              <w:rPr>
-                <w:rFonts w:ascii="楷体" w:eastAsia="楷体" w:hAnsi="楷体" w:hint="eastAsia"/>
-                <w:color w:val="000000"/>
-                <w:sz w:val="28"/>
-                <w:szCs w:val="28"/>
-                <w:lang w:eastAsia="zh-TW"/>
-              </w:rPr>
-              <w:t>李惟舟</w:t>
-            </w:r>
+                <w:lang w:eastAsia="zh-CN"/>
+              </w:rPr>
+            </w:pPr>
           </w:p>
         </w:tc>
       </w:tr>
@@ -17071,16 +15616,6 @@
                 <w:lang w:eastAsia="zh-TW"/>
               </w:rPr>
             </w:pPr>
-            <w:r>
-              <w:rPr>
-                <w:rFonts w:ascii="楷体" w:eastAsia="楷体" w:hAnsi="楷体" w:hint="eastAsia"/>
-                <w:color w:val="000000"/>
-                <w:sz w:val="28"/>
-                <w:szCs w:val="28"/>
-                <w:lang w:eastAsia="zh-CN"/>
-              </w:rPr>
-              <w:t>苏锡安</w:t>
-            </w:r>
           </w:p>
         </w:tc>
         <w:tc>
@@ -17109,16 +15644,6 @@
                 <w:lang w:eastAsia="zh-CN"/>
               </w:rPr>
             </w:pPr>
-            <w:r>
-              <w:rPr>
-                <w:rFonts w:ascii="楷体" w:eastAsia="楷体" w:hAnsi="楷体" w:hint="eastAsia"/>
-                <w:color w:val="000000"/>
-                <w:sz w:val="28"/>
-                <w:szCs w:val="28"/>
-                <w:lang w:eastAsia="zh-CN"/>
-              </w:rPr>
-              <w:t>李帆</w:t>
-            </w:r>
           </w:p>
         </w:tc>
         <w:tc>
@@ -17148,36 +15673,6 @@
                 <w:lang w:eastAsia="zh-CN"/>
               </w:rPr>
             </w:pPr>
-            <w:r>
-              <w:rPr>
-                <w:rFonts w:ascii="楷体" w:eastAsia="楷体" w:hAnsi="楷体" w:hint="eastAsia"/>
-                <w:color w:val="000000"/>
-                <w:sz w:val="28"/>
-                <w:szCs w:val="28"/>
-                <w:lang w:eastAsia="zh-CN"/>
-              </w:rPr>
-              <w:t>蔡珂</w:t>
-            </w:r>
-            <w:r>
-              <w:rPr>
-                <w:rFonts w:ascii="Cambria" w:eastAsia="楷体" w:hAnsi="Cambria" w:cs="Apple Color Emoji"/>
-                <w:color w:val="000000"/>
-                <w:sz w:val="28"/>
-                <w:szCs w:val="28"/>
-                <w:lang w:eastAsia="zh-TW"/>
-              </w:rPr>
-              <w:t>&amp;</w:t>
-            </w:r>
-            <w:r>
-              <w:rPr>
-                <w:rFonts w:ascii="楷体" w:eastAsia="楷体" w:hAnsi="楷体" w:hint="eastAsia"/>
-                <w:color w:val="000000"/>
-                <w:sz w:val="28"/>
-                <w:szCs w:val="28"/>
-                <w:lang w:eastAsia="zh-CN"/>
-              </w:rPr>
-              <w:t>叶俊生</w:t>
-            </w:r>
           </w:p>
         </w:tc>
         <w:tc>
@@ -17206,36 +15701,6 @@
                 <w:lang w:eastAsia="zh-TW"/>
               </w:rPr>
             </w:pPr>
-            <w:r>
-              <w:rPr>
-                <w:rFonts w:ascii="Apple Color Emoji" w:eastAsia="楷体" w:hAnsi="Apple Color Emoji" w:cs="Apple Color Emoji" w:hint="eastAsia"/>
-                <w:color w:val="000000"/>
-                <w:sz w:val="28"/>
-                <w:szCs w:val="28"/>
-                <w:lang w:eastAsia="zh-TW"/>
-              </w:rPr>
-              <w:t>彭菁瑩</w:t>
-            </w:r>
-            <w:r>
-              <w:rPr>
-                <w:rFonts w:ascii="Cambria" w:eastAsia="楷体" w:hAnsi="Cambria" w:cs="Apple Color Emoji"/>
-                <w:color w:val="000000"/>
-                <w:sz w:val="28"/>
-                <w:szCs w:val="28"/>
-                <w:lang w:eastAsia="zh-TW"/>
-              </w:rPr>
-              <w:t>&amp;John</w:t>
-            </w:r>
-            <w:r>
-              <w:rPr>
-                <w:rFonts w:ascii="Cambria" w:eastAsia="楷体" w:hAnsi="Cambria" w:cs="Apple Color Emoji" w:hint="eastAsia"/>
-                <w:color w:val="000000"/>
-                <w:sz w:val="28"/>
-                <w:szCs w:val="28"/>
-                <w:lang w:eastAsia="zh-TW"/>
-              </w:rPr>
-              <w:t>段</w:t>
-            </w:r>
           </w:p>
         </w:tc>
       </w:tr>
@@ -17312,29 +15777,6 @@
               <w:spacing w:after="0" w:line="240" w:lineRule="auto"/>
               <w:jc w:val="center"/>
               <w:rPr>
-                <w:rFonts w:ascii="楷体" w:eastAsia="楷体" w:hAnsi="楷体" w:cs="微软雅黑"/>
-                <w:spacing w:val="-6"/>
-                <w:sz w:val="28"/>
-                <w:szCs w:val="28"/>
-                <w:lang w:eastAsia="zh-CN"/>
-              </w:rPr>
-            </w:pPr>
-            <w:r>
-              <w:rPr>
-                <w:rFonts w:ascii="楷体" w:eastAsia="楷体" w:hAnsi="楷体" w:cs="微软雅黑" w:hint="eastAsia"/>
-                <w:spacing w:val="-6"/>
-                <w:sz w:val="28"/>
-                <w:szCs w:val="28"/>
-                <w:lang w:eastAsia="zh-CN"/>
-              </w:rPr>
-              <w:t>倪酒鑫</w:t>
-            </w:r>
-          </w:p>
-          <w:p>
-            <w:pPr>
-              <w:spacing w:after="0" w:line="240" w:lineRule="auto"/>
-              <w:jc w:val="center"/>
-              <w:rPr>
                 <w:rFonts w:ascii="楷体" w:eastAsia="楷体" w:hAnsi="楷体"/>
                 <w:color w:val="000000"/>
                 <w:sz w:val="28"/>
@@ -17342,16 +15784,6 @@
                 <w:lang w:eastAsia="zh-TW"/>
               </w:rPr>
             </w:pPr>
-            <w:r>
-              <w:rPr>
-                <w:rFonts w:eastAsia="楷体" w:hint="eastAsia"/>
-                <w:color w:val="000000"/>
-                <w:sz w:val="28"/>
-                <w:szCs w:val="28"/>
-                <w:lang w:eastAsia="zh-CN"/>
-              </w:rPr>
-              <w:t>陈冠宇</w:t>
-            </w:r>
           </w:p>
         </w:tc>
         <w:tc>
@@ -17373,28 +15805,6 @@
               <w:spacing w:after="0" w:line="240" w:lineRule="auto"/>
               <w:jc w:val="center"/>
               <w:rPr>
-                <w:rFonts w:ascii="楷体" w:eastAsia="楷体" w:hAnsi="楷体" w:cs="微软雅黑"/>
-                <w:spacing w:val="-3"/>
-                <w:sz w:val="28"/>
-                <w:szCs w:val="28"/>
-                <w:lang w:eastAsia="zh-CN"/>
-              </w:rPr>
-            </w:pPr>
-            <w:r>
-              <w:rPr>
-                <w:rFonts w:ascii="楷体" w:eastAsia="楷体" w:hAnsi="楷体" w:cs="微软雅黑" w:hint="eastAsia"/>
-                <w:spacing w:val="-3"/>
-                <w:sz w:val="28"/>
-                <w:szCs w:val="28"/>
-              </w:rPr>
-              <w:t>鍾學謙</w:t>
-            </w:r>
-          </w:p>
-          <w:p>
-            <w:pPr>
-              <w:spacing w:after="0" w:line="240" w:lineRule="auto"/>
-              <w:jc w:val="center"/>
-              <w:rPr>
                 <w:rFonts w:ascii="楷体" w:eastAsia="楷体" w:hAnsi="楷体"/>
                 <w:color w:val="000000"/>
                 <w:sz w:val="28"/>
@@ -17402,26 +15812,6 @@
                 <w:lang w:eastAsia="zh-CN"/>
               </w:rPr>
             </w:pPr>
-            <w:r>
-              <w:rPr>
-                <w:rFonts w:eastAsia="楷体"/>
-                <w:color w:val="000000"/>
-                <w:sz w:val="28"/>
-                <w:szCs w:val="28"/>
-                <w:lang w:eastAsia="zh-CN"/>
-              </w:rPr>
-              <w:t>Leo</w:t>
-            </w:r>
-            <w:r>
-              <w:rPr>
-                <w:rFonts w:ascii="楷体" w:eastAsia="楷体" w:hAnsi="楷体" w:hint="eastAsia"/>
-                <w:color w:val="000000"/>
-                <w:sz w:val="28"/>
-                <w:szCs w:val="28"/>
-                <w:lang w:eastAsia="zh-CN"/>
-              </w:rPr>
-              <w:t>郭</w:t>
-            </w:r>
           </w:p>
         </w:tc>
         <w:tc>
@@ -17444,27 +15834,6 @@
               <w:spacing w:after="0" w:line="240" w:lineRule="auto"/>
               <w:jc w:val="center"/>
               <w:rPr>
-                <w:rFonts w:ascii="楷体" w:eastAsia="楷体" w:hAnsi="楷体" w:cs="宋体"/>
-                <w:sz w:val="28"/>
-                <w:szCs w:val="28"/>
-                <w:lang w:eastAsia="zh-CN"/>
-              </w:rPr>
-            </w:pPr>
-            <w:r>
-              <w:rPr>
-                <w:rFonts w:ascii="楷体" w:eastAsia="楷体" w:hAnsi="楷体" w:cs="宋体" w:hint="eastAsia"/>
-                <w:sz w:val="28"/>
-                <w:szCs w:val="28"/>
-                <w:lang w:eastAsia="zh-CN"/>
-              </w:rPr>
-              <w:t>黄建嘉</w:t>
-            </w:r>
-          </w:p>
-          <w:p>
-            <w:pPr>
-              <w:spacing w:after="0" w:line="240" w:lineRule="auto"/>
-              <w:jc w:val="center"/>
-              <w:rPr>
                 <w:rFonts w:ascii="楷体" w:eastAsia="楷体" w:hAnsi="楷体"/>
                 <w:color w:val="000000"/>
                 <w:sz w:val="28"/>
@@ -17472,15 +15841,6 @@
                 <w:lang w:eastAsia="zh-CN"/>
               </w:rPr>
             </w:pPr>
-            <w:r>
-              <w:rPr>
-                <w:rFonts w:ascii="楷体" w:eastAsia="楷体" w:hAnsi="楷体" w:cs="宋体" w:hint="eastAsia"/>
-                <w:sz w:val="28"/>
-                <w:szCs w:val="28"/>
-                <w:lang w:eastAsia="zh-CN"/>
-              </w:rPr>
-              <w:t>吴翔</w:t>
-            </w:r>
           </w:p>
         </w:tc>
         <w:tc>
@@ -17508,36 +15868,6 @@
                 <w:lang w:eastAsia="zh-TW"/>
               </w:rPr>
             </w:pPr>
-            <w:r>
-              <w:rPr>
-                <w:rFonts w:ascii="楷体" w:eastAsia="楷体" w:hAnsi="楷体" w:cs="宋体" w:hint="eastAsia"/>
-                <w:sz w:val="28"/>
-                <w:szCs w:val="28"/>
-                <w:lang w:eastAsia="zh-CN"/>
-              </w:rPr>
-              <w:t>黃曉彤</w:t>
-            </w:r>
-          </w:p>
-          <w:p>
-            <w:pPr>
-              <w:spacing w:after="0" w:line="240" w:lineRule="auto"/>
-              <w:jc w:val="center"/>
-              <w:rPr>
-                <w:rFonts w:ascii="楷体" w:eastAsia="楷体" w:hAnsi="楷体" w:cs="宋体"/>
-                <w:sz w:val="28"/>
-                <w:szCs w:val="28"/>
-                <w:lang w:eastAsia="zh-TW"/>
-              </w:rPr>
-            </w:pPr>
-            <w:r>
-              <w:rPr>
-                <w:rFonts w:ascii="楷体" w:eastAsia="楷体" w:hAnsi="楷体" w:cs="宋体" w:hint="eastAsia"/>
-                <w:sz w:val="28"/>
-                <w:szCs w:val="28"/>
-                <w:lang w:eastAsia="zh-TW"/>
-              </w:rPr>
-              <w:t>陳冠宇</w:t>
-            </w:r>
           </w:p>
         </w:tc>
       </w:tr>
@@ -17621,18 +15951,6 @@
                 <w:lang w:eastAsia="zh-CN"/>
               </w:rPr>
             </w:pPr>
-            <w:bookmarkStart w:id="8" w:name="OLE_LINK3"/>
-            <w:r>
-              <w:rPr>
-                <w:rFonts w:eastAsia="楷体" w:hint="eastAsia"/>
-                <w:spacing w:val="-1"/>
-                <w:sz w:val="28"/>
-                <w:szCs w:val="28"/>
-                <w:lang w:eastAsia="zh-CN"/>
-              </w:rPr>
-              <w:t>Manson</w:t>
-            </w:r>
-            <w:bookmarkEnd w:id="8"/>
           </w:p>
         </w:tc>
         <w:tc>
@@ -17661,16 +15979,6 @@
                 <w:lang w:eastAsia="zh-TW"/>
               </w:rPr>
             </w:pPr>
-            <w:r>
-              <w:rPr>
-                <w:rFonts w:eastAsia="楷体" w:hint="eastAsia"/>
-                <w:spacing w:val="-1"/>
-                <w:sz w:val="28"/>
-                <w:szCs w:val="28"/>
-                <w:lang w:eastAsia="zh-CN"/>
-              </w:rPr>
-              <w:t>安海林</w:t>
-            </w:r>
           </w:p>
         </w:tc>
         <w:tc>
@@ -17700,26 +16008,6 @@
                 <w:lang w:eastAsia="zh-CN"/>
               </w:rPr>
             </w:pPr>
-            <w:r>
-              <w:rPr>
-                <w:rFonts w:eastAsia="楷体" w:hint="eastAsia"/>
-                <w:spacing w:val="-1"/>
-                <w:sz w:val="28"/>
-                <w:szCs w:val="28"/>
-                <w:lang w:eastAsia="zh-CN"/>
-              </w:rPr>
-              <w:t>Jerry</w:t>
-            </w:r>
-            <w:r>
-              <w:rPr>
-                <w:rFonts w:eastAsia="楷体" w:hint="eastAsia"/>
-                <w:spacing w:val="-1"/>
-                <w:sz w:val="28"/>
-                <w:szCs w:val="28"/>
-                <w:lang w:eastAsia="zh-CN"/>
-              </w:rPr>
-              <w:t>祝</w:t>
-            </w:r>
           </w:p>
         </w:tc>
         <w:tc>
@@ -17748,26 +16036,6 @@
                 <w:lang w:eastAsia="zh-TW"/>
               </w:rPr>
             </w:pPr>
-            <w:r>
-              <w:rPr>
-                <w:rFonts w:eastAsia="楷体"/>
-                <w:spacing w:val="-1"/>
-                <w:sz w:val="28"/>
-                <w:szCs w:val="28"/>
-                <w:lang w:eastAsia="zh-TW"/>
-              </w:rPr>
-              <w:t>Leo</w:t>
-            </w:r>
-            <w:r>
-              <w:rPr>
-                <w:rFonts w:eastAsia="楷体" w:hint="eastAsia"/>
-                <w:spacing w:val="-1"/>
-                <w:sz w:val="28"/>
-                <w:szCs w:val="28"/>
-                <w:lang w:eastAsia="zh-TW"/>
-              </w:rPr>
-              <w:t>郭</w:t>
-            </w:r>
           </w:p>
         </w:tc>
       </w:tr>
@@ -17851,16 +16119,6 @@
                 <w:lang w:eastAsia="zh-TW"/>
               </w:rPr>
             </w:pPr>
-            <w:r>
-              <w:rPr>
-                <w:rFonts w:ascii="楷体" w:eastAsia="楷体" w:hAnsi="楷体" w:cs="微软雅黑" w:hint="eastAsia"/>
-                <w:spacing w:val="-7"/>
-                <w:position w:val="-2"/>
-                <w:sz w:val="28"/>
-                <w:szCs w:val="28"/>
-              </w:rPr>
-              <w:t>龔師母</w:t>
-            </w:r>
           </w:p>
         </w:tc>
         <w:tc>
@@ -17889,17 +16147,6 @@
                 <w:lang w:eastAsia="zh-TW"/>
               </w:rPr>
             </w:pPr>
-            <w:r>
-              <w:rPr>
-                <w:rFonts w:ascii="楷体" w:eastAsia="楷体" w:hAnsi="楷体" w:cs="微软雅黑" w:hint="eastAsia"/>
-                <w:spacing w:val="-4"/>
-                <w:position w:val="-1"/>
-                <w:sz w:val="28"/>
-                <w:szCs w:val="28"/>
-                <w:lang w:eastAsia="zh-CN"/>
-              </w:rPr>
-              <w:t>龔師母</w:t>
-            </w:r>
           </w:p>
         </w:tc>
         <w:tc>
@@ -17929,16 +16176,6 @@
                 <w:lang w:eastAsia="zh-CN"/>
               </w:rPr>
             </w:pPr>
-            <w:r>
-              <w:rPr>
-                <w:rFonts w:ascii="楷体" w:eastAsia="楷体" w:hAnsi="楷体" w:cs="微软雅黑" w:hint="eastAsia"/>
-                <w:spacing w:val="-7"/>
-                <w:position w:val="-2"/>
-                <w:sz w:val="28"/>
-                <w:szCs w:val="28"/>
-              </w:rPr>
-              <w:t>龔師母</w:t>
-            </w:r>
           </w:p>
         </w:tc>
         <w:tc>
@@ -17967,16 +16204,6 @@
                 <w:lang w:eastAsia="zh-TW"/>
               </w:rPr>
             </w:pPr>
-            <w:r>
-              <w:rPr>
-                <w:rFonts w:ascii="楷体" w:eastAsia="楷体" w:hAnsi="楷体" w:cs="微软雅黑" w:hint="eastAsia"/>
-                <w:spacing w:val="-7"/>
-                <w:position w:val="-2"/>
-                <w:sz w:val="28"/>
-                <w:szCs w:val="28"/>
-              </w:rPr>
-              <w:t>龔師母</w:t>
-            </w:r>
           </w:p>
         </w:tc>
       </w:tr>
@@ -18053,6 +16280,34 @@
               <w:spacing w:after="0" w:line="240" w:lineRule="auto"/>
               <w:jc w:val="center"/>
               <w:rPr>
+                <w:rFonts w:eastAsia="楷体"/>
+                <w:color w:val="000000"/>
+                <w:sz w:val="28"/>
+                <w:szCs w:val="28"/>
+                <w:lang w:eastAsia="zh-CN"/>
+              </w:rPr>
+            </w:pPr>
+          </w:p>
+        </w:tc>
+        <w:tc>
+          <w:tcPr>
+            <w:tcW w:w="1986" w:type="dxa"/>
+            <w:tcBorders>
+              <w:top w:val="single" w:sz="8" w:space="0" w:color="000000"/>
+              <w:left w:val="single" w:sz="8" w:space="0" w:color="000000"/>
+              <w:bottom w:val="single" w:sz="8" w:space="0" w:color="000000"/>
+              <w:right w:val="single" w:sz="8" w:space="0" w:color="000000"/>
+              <w:tl2br w:val="nil"/>
+              <w:tr2bl w:val="nil"/>
+            </w:tcBorders>
+            <w:shd w:val="clear" w:color="auto" w:fill="FFFFFF"/>
+            <w:vAlign w:val="center"/>
+          </w:tcPr>
+          <w:p>
+            <w:pPr>
+              <w:spacing w:after="0" w:line="240" w:lineRule="auto"/>
+              <w:jc w:val="center"/>
+              <w:rPr>
                 <w:rFonts w:ascii="楷体" w:eastAsia="楷体" w:hAnsi="楷体"/>
                 <w:color w:val="000000"/>
                 <w:sz w:val="28"/>
@@ -18060,54 +16315,12 @@
                 <w:lang w:eastAsia="zh-CN"/>
               </w:rPr>
             </w:pPr>
-            <w:r>
-              <w:rPr>
-                <w:rFonts w:ascii="楷体" w:eastAsia="楷体" w:hAnsi="楷体" w:hint="eastAsia"/>
-                <w:color w:val="000000"/>
-                <w:sz w:val="28"/>
-                <w:szCs w:val="28"/>
-                <w:lang w:eastAsia="zh-CN"/>
-              </w:rPr>
-              <w:t>黄淳</w:t>
-            </w:r>
-          </w:p>
-          <w:p>
-            <w:pPr>
-              <w:spacing w:after="0" w:line="240" w:lineRule="auto"/>
-              <w:jc w:val="center"/>
-              <w:rPr>
-                <w:rFonts w:eastAsia="楷体"/>
-                <w:color w:val="000000"/>
-                <w:sz w:val="28"/>
-                <w:szCs w:val="28"/>
-                <w:lang w:eastAsia="zh-CN"/>
-              </w:rPr>
-            </w:pPr>
-            <w:r>
-              <w:rPr>
-                <w:rFonts w:eastAsia="楷体"/>
-                <w:color w:val="000000"/>
-                <w:sz w:val="28"/>
-                <w:szCs w:val="28"/>
-                <w:lang w:eastAsia="zh-CN"/>
-              </w:rPr>
-              <w:t>Sam</w:t>
-            </w:r>
-            <w:r>
-              <w:rPr>
-                <w:rFonts w:ascii="楷体" w:eastAsia="楷体" w:hAnsi="楷体" w:hint="eastAsia"/>
-                <w:color w:val="000000"/>
-                <w:sz w:val="28"/>
-                <w:szCs w:val="28"/>
-                <w:lang w:eastAsia="zh-CN"/>
-              </w:rPr>
-              <w:t>宿</w:t>
-            </w:r>
-          </w:p>
-        </w:tc>
-        <w:tc>
-          <w:tcPr>
-            <w:tcW w:w="1986" w:type="dxa"/>
+          </w:p>
+        </w:tc>
+        <w:tc>
+          <w:tcPr>
+            <w:tcW w:w="1985" w:type="dxa"/>
+            <w:gridSpan w:val="2"/>
             <w:tcBorders>
               <w:top w:val="single" w:sz="8" w:space="0" w:color="000000"/>
               <w:left w:val="single" w:sz="8" w:space="0" w:color="000000"/>
@@ -18131,17 +16344,22 @@
                 <w:lang w:eastAsia="zh-CN"/>
               </w:rPr>
             </w:pPr>
-            <w:r>
-              <w:rPr>
-                <w:rFonts w:ascii="楷体" w:eastAsia="楷体" w:hAnsi="楷体" w:hint="eastAsia"/>
-                <w:color w:val="000000"/>
-                <w:sz w:val="28"/>
-                <w:szCs w:val="28"/>
-                <w:lang w:eastAsia="zh-CN"/>
-              </w:rPr>
-              <w:t>刘美</w:t>
-            </w:r>
-          </w:p>
+          </w:p>
+        </w:tc>
+        <w:tc>
+          <w:tcPr>
+            <w:tcW w:w="2268" w:type="dxa"/>
+            <w:tcBorders>
+              <w:top w:val="single" w:sz="8" w:space="0" w:color="000000"/>
+              <w:left w:val="single" w:sz="8" w:space="0" w:color="000000"/>
+              <w:bottom w:val="single" w:sz="8" w:space="0" w:color="000000"/>
+              <w:right w:val="single" w:sz="8" w:space="0" w:color="000000"/>
+              <w:tl2br w:val="nil"/>
+              <w:tr2bl w:val="nil"/>
+            </w:tcBorders>
+            <w:shd w:val="clear" w:color="auto" w:fill="FFFFFF"/>
+            <w:vAlign w:val="center"/>
+          </w:tcPr>
           <w:p>
             <w:pPr>
               <w:spacing w:after="0" w:line="240" w:lineRule="auto"/>
@@ -18151,152 +16369,9 @@
                 <w:color w:val="000000"/>
                 <w:sz w:val="28"/>
                 <w:szCs w:val="28"/>
-                <w:lang w:eastAsia="zh-CN"/>
-              </w:rPr>
-            </w:pPr>
-            <w:r>
-              <w:rPr>
-                <w:rFonts w:ascii="楷体" w:eastAsia="楷体" w:hAnsi="楷体" w:hint="eastAsia"/>
-                <w:color w:val="000000"/>
-                <w:sz w:val="28"/>
-                <w:szCs w:val="28"/>
-                <w:lang w:eastAsia="zh-CN"/>
-              </w:rPr>
-              <w:t>李小焰</w:t>
-            </w:r>
-          </w:p>
-        </w:tc>
-        <w:tc>
-          <w:tcPr>
-            <w:tcW w:w="1985" w:type="dxa"/>
-            <w:gridSpan w:val="2"/>
-            <w:tcBorders>
-              <w:top w:val="single" w:sz="8" w:space="0" w:color="000000"/>
-              <w:left w:val="single" w:sz="8" w:space="0" w:color="000000"/>
-              <w:bottom w:val="single" w:sz="8" w:space="0" w:color="000000"/>
-              <w:right w:val="single" w:sz="8" w:space="0" w:color="000000"/>
-              <w:tl2br w:val="nil"/>
-              <w:tr2bl w:val="nil"/>
-            </w:tcBorders>
-            <w:shd w:val="clear" w:color="auto" w:fill="FFFFFF"/>
-            <w:vAlign w:val="center"/>
-          </w:tcPr>
-          <w:p>
-            <w:pPr>
-              <w:spacing w:after="0" w:line="240" w:lineRule="auto"/>
-              <w:jc w:val="center"/>
-              <w:rPr>
-                <w:rFonts w:ascii="楷体" w:eastAsia="楷体" w:hAnsi="楷体"/>
-                <w:color w:val="000000"/>
-                <w:sz w:val="28"/>
-                <w:szCs w:val="28"/>
-                <w:lang w:eastAsia="zh-CN"/>
-              </w:rPr>
-            </w:pPr>
-            <w:r>
-              <w:rPr>
-                <w:rFonts w:ascii="楷体" w:eastAsia="楷体" w:hAnsi="楷体" w:hint="eastAsia"/>
-                <w:color w:val="000000"/>
-                <w:sz w:val="28"/>
-                <w:szCs w:val="28"/>
-                <w:lang w:eastAsia="zh-CN"/>
-              </w:rPr>
-              <w:t>任月锋</w:t>
-            </w:r>
-          </w:p>
-          <w:p>
-            <w:pPr>
-              <w:spacing w:after="0" w:line="240" w:lineRule="auto"/>
-              <w:jc w:val="center"/>
-              <w:rPr>
-                <w:rFonts w:ascii="楷体" w:eastAsia="楷体" w:hAnsi="楷体"/>
-                <w:color w:val="000000"/>
-                <w:sz w:val="28"/>
-                <w:szCs w:val="28"/>
-                <w:lang w:eastAsia="zh-CN"/>
-              </w:rPr>
-            </w:pPr>
-            <w:r>
-              <w:rPr>
-                <w:rFonts w:eastAsia="楷体"/>
-                <w:color w:val="000000"/>
-                <w:sz w:val="28"/>
-                <w:szCs w:val="28"/>
-                <w:lang w:eastAsia="zh-CN"/>
-              </w:rPr>
-              <w:t>Sam</w:t>
-            </w:r>
-            <w:r>
-              <w:rPr>
-                <w:rFonts w:ascii="楷体" w:eastAsia="楷体" w:hAnsi="楷体" w:hint="eastAsia"/>
-                <w:color w:val="000000"/>
-                <w:sz w:val="28"/>
-                <w:szCs w:val="28"/>
-                <w:lang w:eastAsia="zh-CN"/>
-              </w:rPr>
-              <w:t>宿</w:t>
-            </w:r>
-          </w:p>
-        </w:tc>
-        <w:tc>
-          <w:tcPr>
-            <w:tcW w:w="2268" w:type="dxa"/>
-            <w:tcBorders>
-              <w:top w:val="single" w:sz="8" w:space="0" w:color="000000"/>
-              <w:left w:val="single" w:sz="8" w:space="0" w:color="000000"/>
-              <w:bottom w:val="single" w:sz="8" w:space="0" w:color="000000"/>
-              <w:right w:val="single" w:sz="8" w:space="0" w:color="000000"/>
-              <w:tl2br w:val="nil"/>
-              <w:tr2bl w:val="nil"/>
-            </w:tcBorders>
-            <w:shd w:val="clear" w:color="auto" w:fill="FFFFFF"/>
-            <w:vAlign w:val="center"/>
-          </w:tcPr>
-          <w:p>
-            <w:pPr>
-              <w:spacing w:after="0" w:line="240" w:lineRule="auto"/>
-              <w:jc w:val="center"/>
-              <w:rPr>
-                <w:rFonts w:ascii="楷体" w:eastAsia="楷体" w:hAnsi="楷体"/>
-                <w:color w:val="000000"/>
-                <w:sz w:val="28"/>
-                <w:szCs w:val="28"/>
-                <w:lang w:eastAsia="zh-TW"/>
-              </w:rPr>
-            </w:pPr>
-            <w:r>
-              <w:rPr>
-                <w:rFonts w:ascii="楷体" w:eastAsia="楷体" w:hAnsi="楷体" w:hint="eastAsia"/>
-                <w:color w:val="000000"/>
-                <w:sz w:val="28"/>
-                <w:szCs w:val="28"/>
-                <w:lang w:eastAsia="zh-CN"/>
-              </w:rPr>
-              <w:t>倪師母</w:t>
-            </w:r>
-          </w:p>
-          <w:p>
-            <w:pPr>
-              <w:spacing w:after="0" w:line="240" w:lineRule="auto"/>
-              <w:jc w:val="center"/>
-              <w:rPr>
-                <w:rFonts w:ascii="楷体" w:eastAsia="楷体" w:hAnsi="楷体"/>
-                <w:color w:val="000000"/>
-                <w:sz w:val="28"/>
-                <w:szCs w:val="28"/>
-                <w:lang w:eastAsia="zh-TW"/>
-              </w:rPr>
-            </w:pPr>
-            <w:r>
-              <w:rPr>
-                <w:rFonts w:ascii="楷体" w:eastAsia="楷体" w:hAnsi="楷体" w:hint="eastAsia"/>
-                <w:color w:val="000000"/>
-                <w:sz w:val="28"/>
-                <w:szCs w:val="28"/>
-                <w:lang w:eastAsia="zh-TW"/>
-              </w:rPr>
-              <w:t>梁燕華</w:t>
-            </w:r>
+                <w:lang w:eastAsia="zh-TW"/>
+              </w:rPr>
+            </w:pPr>
           </w:p>
         </w:tc>
       </w:tr>
@@ -18380,16 +16455,6 @@
                 <w:lang w:eastAsia="zh-CN"/>
               </w:rPr>
             </w:pPr>
-            <w:r>
-              <w:rPr>
-                <w:rFonts w:ascii="楷体" w:eastAsia="楷体" w:hAnsi="楷体" w:hint="eastAsia"/>
-                <w:color w:val="000000"/>
-                <w:sz w:val="28"/>
-                <w:szCs w:val="28"/>
-                <w:lang w:eastAsia="zh-CN"/>
-              </w:rPr>
-              <w:t>李永剛</w:t>
-            </w:r>
           </w:p>
         </w:tc>
         <w:tc>
@@ -18418,16 +16483,6 @@
                 <w:lang w:eastAsia="zh-TW"/>
               </w:rPr>
             </w:pPr>
-            <w:r>
-              <w:rPr>
-                <w:rFonts w:eastAsia="楷体" w:hint="eastAsia"/>
-                <w:spacing w:val="-1"/>
-                <w:sz w:val="28"/>
-                <w:szCs w:val="28"/>
-                <w:lang w:eastAsia="zh-CN"/>
-              </w:rPr>
-              <w:t>Manson</w:t>
-            </w:r>
           </w:p>
         </w:tc>
         <w:tc>
@@ -18457,16 +16512,6 @@
                 <w:lang w:eastAsia="zh-TW"/>
               </w:rPr>
             </w:pPr>
-            <w:r>
-              <w:rPr>
-                <w:rFonts w:ascii="楷体" w:eastAsia="楷体" w:hAnsi="楷体" w:hint="eastAsia"/>
-                <w:color w:val="000000"/>
-                <w:sz w:val="28"/>
-                <w:szCs w:val="28"/>
-                <w:lang w:eastAsia="zh-CN"/>
-              </w:rPr>
-              <w:t>程澈</w:t>
-            </w:r>
           </w:p>
         </w:tc>
         <w:tc>
@@ -18495,16 +16540,6 @@
                 <w:lang w:eastAsia="zh-CN"/>
               </w:rPr>
             </w:pPr>
-            <w:r>
-              <w:rPr>
-                <w:rFonts w:ascii="楷体" w:eastAsia="楷体" w:hAnsi="楷体" w:hint="eastAsia"/>
-                <w:color w:val="000000"/>
-                <w:sz w:val="28"/>
-                <w:szCs w:val="28"/>
-                <w:lang w:eastAsia="zh-CN"/>
-              </w:rPr>
-              <w:t>郭力暉</w:t>
-            </w:r>
           </w:p>
         </w:tc>
       </w:tr>
@@ -18606,17 +16641,21 @@
                 <w:lang w:eastAsia="zh-CN"/>
               </w:rPr>
             </w:pPr>
-            <w:r>
-              <w:rPr>
-                <w:rFonts w:ascii="楷体" w:eastAsia="楷体" w:hAnsi="楷体" w:hint="eastAsia"/>
-                <w:color w:val="000000"/>
-                <w:sz w:val="28"/>
-                <w:szCs w:val="28"/>
-                <w:lang w:eastAsia="zh-CN"/>
-              </w:rPr>
-              <w:t>李帆</w:t>
-            </w:r>
-          </w:p>
+          </w:p>
+        </w:tc>
+        <w:tc>
+          <w:tcPr>
+            <w:tcW w:w="1986" w:type="dxa"/>
+            <w:tcBorders>
+              <w:top w:val="single" w:sz="8" w:space="0" w:color="000000"/>
+              <w:left w:val="single" w:sz="8" w:space="0" w:color="000000"/>
+              <w:right w:val="single" w:sz="4" w:space="0" w:color="auto"/>
+              <w:tl2br w:val="nil"/>
+              <w:tr2bl w:val="nil"/>
+            </w:tcBorders>
+            <w:shd w:val="clear" w:color="auto" w:fill="FFFFFF"/>
+            <w:vAlign w:val="center"/>
+          </w:tcPr>
           <w:p>
             <w:pPr>
               <w:spacing w:after="0" w:line="240" w:lineRule="auto"/>
@@ -18629,129 +16668,6 @@
                 <w:lang w:eastAsia="zh-CN"/>
               </w:rPr>
             </w:pPr>
-            <w:r>
-              <w:rPr>
-                <w:rFonts w:ascii="楷体" w:eastAsia="楷体" w:hAnsi="楷体" w:hint="eastAsia"/>
-                <w:color w:val="000000"/>
-                <w:sz w:val="28"/>
-                <w:szCs w:val="28"/>
-                <w:lang w:eastAsia="zh-CN"/>
-              </w:rPr>
-              <w:t>倪师母</w:t>
-            </w:r>
-            <w:r>
-              <w:rPr>
-                <w:rFonts w:ascii="Cambria" w:eastAsia="楷体" w:hAnsi="Cambria" w:cs="Apple Color Emoji"/>
-                <w:color w:val="000000"/>
-                <w:sz w:val="28"/>
-                <w:szCs w:val="28"/>
-                <w:lang w:eastAsia="zh-TW"/>
-              </w:rPr>
-              <w:t>&amp;</w:t>
-            </w:r>
-            <w:r>
-              <w:rPr>
-                <w:rFonts w:ascii="楷体" w:eastAsia="楷体" w:hAnsi="楷体" w:hint="eastAsia"/>
-                <w:color w:val="000000"/>
-                <w:sz w:val="28"/>
-                <w:szCs w:val="28"/>
-                <w:lang w:eastAsia="zh-CN"/>
-              </w:rPr>
-              <w:t>姜官芳</w:t>
-            </w:r>
-          </w:p>
-          <w:p>
-            <w:pPr>
-              <w:spacing w:after="0" w:line="240" w:lineRule="auto"/>
-              <w:jc w:val="center"/>
-              <w:rPr>
-                <w:rFonts w:ascii="楷体" w:eastAsia="楷体" w:hAnsi="楷体"/>
-                <w:color w:val="000000"/>
-                <w:sz w:val="28"/>
-                <w:szCs w:val="28"/>
-                <w:lang w:eastAsia="zh-CN"/>
-              </w:rPr>
-            </w:pPr>
-            <w:r>
-              <w:rPr>
-                <w:rFonts w:ascii="楷体" w:eastAsia="楷体" w:hAnsi="楷体" w:hint="eastAsia"/>
-                <w:color w:val="000000"/>
-                <w:sz w:val="28"/>
-                <w:szCs w:val="28"/>
-                <w:lang w:eastAsia="zh-CN"/>
-              </w:rPr>
-              <w:t>陈聆燕</w:t>
-            </w:r>
-          </w:p>
-        </w:tc>
-        <w:tc>
-          <w:tcPr>
-            <w:tcW w:w="1986" w:type="dxa"/>
-            <w:tcBorders>
-              <w:top w:val="single" w:sz="8" w:space="0" w:color="000000"/>
-              <w:left w:val="single" w:sz="8" w:space="0" w:color="000000"/>
-              <w:right w:val="single" w:sz="4" w:space="0" w:color="auto"/>
-              <w:tl2br w:val="nil"/>
-              <w:tr2bl w:val="nil"/>
-            </w:tcBorders>
-            <w:shd w:val="clear" w:color="auto" w:fill="FFFFFF"/>
-            <w:vAlign w:val="center"/>
-          </w:tcPr>
-          <w:p>
-            <w:pPr>
-              <w:spacing w:after="0" w:line="240" w:lineRule="auto"/>
-              <w:jc w:val="center"/>
-              <w:rPr>
-                <w:rFonts w:ascii="楷体" w:eastAsia="楷体" w:hAnsi="楷体"/>
-                <w:color w:val="000000"/>
-                <w:sz w:val="28"/>
-                <w:szCs w:val="28"/>
-                <w:lang w:eastAsia="zh-CN"/>
-              </w:rPr>
-            </w:pPr>
-            <w:r>
-              <w:rPr>
-                <w:rFonts w:ascii="楷体" w:eastAsia="楷体" w:hAnsi="楷体" w:hint="eastAsia"/>
-                <w:color w:val="000000"/>
-                <w:sz w:val="28"/>
-                <w:szCs w:val="28"/>
-                <w:lang w:eastAsia="zh-CN"/>
-              </w:rPr>
-              <w:t>金源</w:t>
-            </w:r>
-            <w:r>
-              <w:rPr>
-                <w:rFonts w:eastAsia="楷体"/>
-                <w:color w:val="000000"/>
-                <w:sz w:val="28"/>
-                <w:szCs w:val="28"/>
-                <w:lang w:eastAsia="zh-CN"/>
-              </w:rPr>
-              <w:t>BBQ</w:t>
-            </w:r>
-          </w:p>
-          <w:p>
-            <w:pPr>
-              <w:spacing w:after="0" w:line="240" w:lineRule="auto"/>
-              <w:jc w:val="center"/>
-              <w:rPr>
-                <w:rFonts w:ascii="楷体" w:eastAsia="楷体" w:hAnsi="楷体"/>
-                <w:color w:val="000000"/>
-                <w:sz w:val="28"/>
-                <w:szCs w:val="28"/>
-                <w:lang w:eastAsia="zh-CN"/>
-              </w:rPr>
-            </w:pPr>
-            <w:r>
-              <w:rPr>
-                <w:rFonts w:ascii="楷体" w:eastAsia="楷体" w:hAnsi="楷体" w:hint="eastAsia"/>
-                <w:color w:val="000000"/>
-                <w:sz w:val="28"/>
-                <w:szCs w:val="28"/>
-                <w:lang w:eastAsia="zh-CN"/>
-              </w:rPr>
-              <w:t>周蕾</w:t>
-            </w:r>
           </w:p>
         </w:tc>
         <w:tc>
@@ -18780,15 +16696,6 @@
                 <w:lang w:eastAsia="zh-CN"/>
               </w:rPr>
             </w:pPr>
-            <w:r>
-              <w:rPr>
-                <w:rFonts w:ascii="楷体" w:eastAsia="楷体" w:hAnsi="楷体" w:hint="eastAsia"/>
-                <w:sz w:val="36"/>
-                <w:szCs w:val="36"/>
-                <w:lang w:eastAsia="zh-CN"/>
-              </w:rPr>
-              <w:t>家庭日</w:t>
-            </w:r>
           </w:p>
         </w:tc>
         <w:tc>
@@ -18816,15 +16723,6 @@
                 <w:lang w:eastAsia="zh-CN"/>
               </w:rPr>
             </w:pPr>
-            <w:r>
-              <w:rPr>
-                <w:rFonts w:ascii="楷体" w:eastAsia="楷体" w:hAnsi="楷体" w:hint="eastAsia"/>
-                <w:sz w:val="36"/>
-                <w:szCs w:val="36"/>
-                <w:lang w:eastAsia="zh-CN"/>
-              </w:rPr>
-              <w:t>小組日</w:t>
-            </w:r>
           </w:p>
         </w:tc>
       </w:tr>
@@ -18902,17 +16800,20 @@
                 <w:lang w:eastAsia="zh-CN"/>
               </w:rPr>
             </w:pPr>
-            <w:r>
-              <w:rPr>
-                <w:rFonts w:ascii="楷体" w:eastAsia="楷体" w:hAnsi="楷体" w:hint="eastAsia"/>
-                <w:color w:val="000000"/>
-                <w:sz w:val="28"/>
-                <w:szCs w:val="28"/>
-                <w:lang w:eastAsia="zh-CN"/>
-              </w:rPr>
-              <w:t>李帆</w:t>
-            </w:r>
-          </w:p>
+          </w:p>
+        </w:tc>
+        <w:tc>
+          <w:tcPr>
+            <w:tcW w:w="1986" w:type="dxa"/>
+            <w:tcBorders>
+              <w:left w:val="single" w:sz="8" w:space="0" w:color="000000"/>
+              <w:right w:val="single" w:sz="4" w:space="0" w:color="auto"/>
+              <w:tl2br w:val="nil"/>
+              <w:tr2bl w:val="nil"/>
+            </w:tcBorders>
+            <w:shd w:val="clear" w:color="auto" w:fill="FFFFFF"/>
+            <w:vAlign w:val="center"/>
+          </w:tcPr>
           <w:p>
             <w:pPr>
               <w:spacing w:after="0" w:line="240" w:lineRule="auto"/>
@@ -18925,121 +16826,6 @@
                 <w:lang w:eastAsia="zh-CN"/>
               </w:rPr>
             </w:pPr>
-            <w:r>
-              <w:rPr>
-                <w:rFonts w:ascii="楷体" w:eastAsia="楷体" w:hAnsi="楷体" w:hint="eastAsia"/>
-                <w:color w:val="000000"/>
-                <w:sz w:val="28"/>
-                <w:szCs w:val="28"/>
-                <w:lang w:eastAsia="zh-CN"/>
-              </w:rPr>
-              <w:t>叶俊生</w:t>
-            </w:r>
-          </w:p>
-          <w:p>
-            <w:pPr>
-              <w:spacing w:after="0" w:line="240" w:lineRule="auto"/>
-              <w:jc w:val="center"/>
-              <w:rPr>
-                <w:rFonts w:ascii="楷体" w:eastAsia="楷体" w:hAnsi="楷体"/>
-                <w:color w:val="000000"/>
-                <w:sz w:val="28"/>
-                <w:szCs w:val="28"/>
-                <w:lang w:eastAsia="zh-CN"/>
-              </w:rPr>
-            </w:pPr>
-            <w:r>
-              <w:rPr>
-                <w:rFonts w:ascii="楷体" w:eastAsia="楷体" w:hAnsi="楷体" w:hint="eastAsia"/>
-                <w:color w:val="000000"/>
-                <w:sz w:val="28"/>
-                <w:szCs w:val="28"/>
-                <w:lang w:eastAsia="zh-CN"/>
-              </w:rPr>
-              <w:t>张巨伟</w:t>
-            </w:r>
-          </w:p>
-        </w:tc>
-        <w:tc>
-          <w:tcPr>
-            <w:tcW w:w="1986" w:type="dxa"/>
-            <w:tcBorders>
-              <w:left w:val="single" w:sz="8" w:space="0" w:color="000000"/>
-              <w:right w:val="single" w:sz="4" w:space="0" w:color="auto"/>
-              <w:tl2br w:val="nil"/>
-              <w:tr2bl w:val="nil"/>
-            </w:tcBorders>
-            <w:shd w:val="clear" w:color="auto" w:fill="FFFFFF"/>
-            <w:vAlign w:val="center"/>
-          </w:tcPr>
-          <w:p>
-            <w:pPr>
-              <w:spacing w:after="0" w:line="240" w:lineRule="auto"/>
-              <w:jc w:val="center"/>
-              <w:rPr>
-                <w:rFonts w:ascii="楷体" w:eastAsia="楷体" w:hAnsi="楷体"/>
-                <w:color w:val="000000"/>
-                <w:sz w:val="28"/>
-                <w:szCs w:val="28"/>
-                <w:lang w:eastAsia="zh-TW"/>
-              </w:rPr>
-            </w:pPr>
-            <w:r>
-              <w:rPr>
-                <w:rFonts w:ascii="楷体" w:eastAsia="楷体" w:hAnsi="楷体" w:hint="eastAsia"/>
-                <w:color w:val="000000"/>
-                <w:sz w:val="28"/>
-                <w:szCs w:val="28"/>
-                <w:lang w:eastAsia="zh-CN"/>
-              </w:rPr>
-              <w:t>陳偉漢</w:t>
-            </w:r>
-          </w:p>
-          <w:p>
-            <w:pPr>
-              <w:spacing w:after="0" w:line="240" w:lineRule="auto"/>
-              <w:jc w:val="center"/>
-              <w:rPr>
-                <w:rFonts w:ascii="楷体" w:eastAsia="楷体" w:hAnsi="楷体"/>
-                <w:color w:val="000000"/>
-                <w:sz w:val="28"/>
-                <w:szCs w:val="28"/>
-                <w:lang w:eastAsia="zh-CN"/>
-              </w:rPr>
-            </w:pPr>
-            <w:r>
-              <w:rPr>
-                <w:rFonts w:ascii="楷体" w:eastAsia="楷体" w:hAnsi="楷体" w:hint="eastAsia"/>
-                <w:color w:val="000000"/>
-                <w:sz w:val="28"/>
-                <w:szCs w:val="28"/>
-                <w:lang w:eastAsia="zh-CN"/>
-              </w:rPr>
-              <w:t>徐高唱</w:t>
-            </w:r>
-          </w:p>
-          <w:p>
-            <w:pPr>
-              <w:spacing w:after="0" w:line="240" w:lineRule="auto"/>
-              <w:jc w:val="center"/>
-              <w:rPr>
-                <w:rFonts w:ascii="楷体" w:eastAsia="楷体" w:hAnsi="楷体"/>
-                <w:color w:val="000000"/>
-                <w:sz w:val="28"/>
-                <w:szCs w:val="28"/>
-                <w:lang w:eastAsia="zh-CN"/>
-              </w:rPr>
-            </w:pPr>
-            <w:r>
-              <w:rPr>
-                <w:rFonts w:ascii="楷体" w:eastAsia="楷体" w:hAnsi="楷体" w:hint="eastAsia"/>
-                <w:color w:val="000000"/>
-                <w:sz w:val="28"/>
-                <w:szCs w:val="28"/>
-                <w:lang w:eastAsia="zh-CN"/>
-              </w:rPr>
-              <w:t>李维</w:t>
-            </w:r>
           </w:p>
         </w:tc>
         <w:tc>
@@ -19166,17 +16952,21 @@
                 <w:lang w:eastAsia="zh-CN"/>
               </w:rPr>
             </w:pPr>
-            <w:r>
-              <w:rPr>
-                <w:rFonts w:ascii="楷体" w:eastAsia="楷体" w:hAnsi="楷体" w:hint="eastAsia"/>
-                <w:color w:val="000000"/>
-                <w:sz w:val="28"/>
-                <w:szCs w:val="28"/>
-                <w:lang w:eastAsia="zh-CN"/>
-              </w:rPr>
-              <w:t>李惟舟</w:t>
-            </w:r>
-          </w:p>
+          </w:p>
+        </w:tc>
+        <w:tc>
+          <w:tcPr>
+            <w:tcW w:w="1986" w:type="dxa"/>
+            <w:tcBorders>
+              <w:left w:val="single" w:sz="8" w:space="0" w:color="000000"/>
+              <w:bottom w:val="single" w:sz="8" w:space="0" w:color="000000"/>
+              <w:right w:val="single" w:sz="4" w:space="0" w:color="auto"/>
+              <w:tl2br w:val="nil"/>
+              <w:tr2bl w:val="nil"/>
+            </w:tcBorders>
+            <w:shd w:val="clear" w:color="auto" w:fill="FFFFFF"/>
+            <w:vAlign w:val="center"/>
+          </w:tcPr>
           <w:p>
             <w:pPr>
               <w:spacing w:after="0" w:line="240" w:lineRule="auto"/>
@@ -19189,122 +16979,6 @@
                 <w:lang w:eastAsia="zh-CN"/>
               </w:rPr>
             </w:pPr>
-            <w:r>
-              <w:rPr>
-                <w:rFonts w:ascii="楷体" w:eastAsia="楷体" w:hAnsi="楷体" w:hint="eastAsia"/>
-                <w:color w:val="000000"/>
-                <w:sz w:val="28"/>
-                <w:szCs w:val="28"/>
-                <w:lang w:eastAsia="zh-CN"/>
-              </w:rPr>
-              <w:t>樂樂</w:t>
-            </w:r>
-          </w:p>
-          <w:p>
-            <w:pPr>
-              <w:spacing w:after="0" w:line="240" w:lineRule="auto"/>
-              <w:jc w:val="center"/>
-              <w:rPr>
-                <w:rFonts w:ascii="楷体" w:eastAsia="楷体" w:hAnsi="楷体"/>
-                <w:color w:val="000000"/>
-                <w:sz w:val="28"/>
-                <w:szCs w:val="28"/>
-                <w:lang w:eastAsia="zh-CN"/>
-              </w:rPr>
-            </w:pPr>
-            <w:r>
-              <w:rPr>
-                <w:rFonts w:ascii="楷体" w:eastAsia="楷体" w:hAnsi="楷体" w:hint="eastAsia"/>
-                <w:color w:val="000000"/>
-                <w:sz w:val="28"/>
-                <w:szCs w:val="28"/>
-                <w:lang w:eastAsia="zh-CN"/>
-              </w:rPr>
-              <w:t>梁燕华</w:t>
-            </w:r>
-          </w:p>
-        </w:tc>
-        <w:tc>
-          <w:tcPr>
-            <w:tcW w:w="1986" w:type="dxa"/>
-            <w:tcBorders>
-              <w:left w:val="single" w:sz="8" w:space="0" w:color="000000"/>
-              <w:bottom w:val="single" w:sz="8" w:space="0" w:color="000000"/>
-              <w:right w:val="single" w:sz="4" w:space="0" w:color="auto"/>
-              <w:tl2br w:val="nil"/>
-              <w:tr2bl w:val="nil"/>
-            </w:tcBorders>
-            <w:shd w:val="clear" w:color="auto" w:fill="FFFFFF"/>
-            <w:vAlign w:val="center"/>
-          </w:tcPr>
-          <w:p>
-            <w:pPr>
-              <w:spacing w:after="0" w:line="240" w:lineRule="auto"/>
-              <w:jc w:val="center"/>
-              <w:rPr>
-                <w:rFonts w:ascii="楷体" w:eastAsia="楷体" w:hAnsi="楷体"/>
-                <w:color w:val="000000"/>
-                <w:sz w:val="28"/>
-                <w:szCs w:val="28"/>
-                <w:lang w:eastAsia="zh-CN"/>
-              </w:rPr>
-            </w:pPr>
-            <w:r>
-              <w:rPr>
-                <w:rFonts w:ascii="楷体" w:eastAsia="楷体" w:hAnsi="楷体" w:hint="eastAsia"/>
-                <w:color w:val="000000"/>
-                <w:sz w:val="28"/>
-                <w:szCs w:val="28"/>
-                <w:lang w:eastAsia="zh-CN"/>
-              </w:rPr>
-              <w:t>张霁</w:t>
-            </w:r>
-          </w:p>
-          <w:p>
-            <w:pPr>
-              <w:spacing w:after="0" w:line="240" w:lineRule="auto"/>
-              <w:jc w:val="center"/>
-              <w:rPr>
-                <w:rFonts w:ascii="楷体" w:eastAsia="楷体" w:hAnsi="楷体"/>
-                <w:color w:val="000000"/>
-                <w:sz w:val="28"/>
-                <w:szCs w:val="28"/>
-                <w:lang w:eastAsia="zh-CN"/>
-              </w:rPr>
-            </w:pPr>
-            <w:r>
-              <w:rPr>
-                <w:rFonts w:ascii="楷体" w:eastAsia="楷体" w:hAnsi="楷体" w:hint="eastAsia"/>
-                <w:color w:val="000000"/>
-                <w:sz w:val="28"/>
-                <w:szCs w:val="28"/>
-                <w:lang w:eastAsia="zh-CN"/>
-              </w:rPr>
-              <w:t>张修</w:t>
-            </w:r>
-          </w:p>
-          <w:p>
-            <w:pPr>
-              <w:spacing w:after="0" w:line="240" w:lineRule="auto"/>
-              <w:jc w:val="center"/>
-              <w:rPr>
-                <w:rFonts w:ascii="楷体" w:eastAsia="楷体" w:hAnsi="楷体"/>
-                <w:color w:val="000000"/>
-                <w:sz w:val="28"/>
-                <w:szCs w:val="28"/>
-                <w:lang w:eastAsia="zh-CN"/>
-              </w:rPr>
-            </w:pPr>
-            <w:r>
-              <w:rPr>
-                <w:rFonts w:ascii="楷体" w:eastAsia="楷体" w:hAnsi="楷体" w:hint="eastAsia"/>
-                <w:color w:val="000000"/>
-                <w:sz w:val="28"/>
-                <w:szCs w:val="28"/>
-                <w:lang w:eastAsia="zh-CN"/>
-              </w:rPr>
-              <w:t>余悦涵</w:t>
-            </w:r>
           </w:p>
         </w:tc>
         <w:tc>
@@ -19392,6 +17066,15 @@
               <w:jc w:val="center"/>
               <w:rPr>
                 <w:rFonts w:ascii="楷体" w:eastAsia="楷体" w:hAnsi="楷体"/>
+                <w:color w:val="000000"/>
+                <w:sz w:val="28"/>
+                <w:szCs w:val="28"/>
+                <w:lang w:eastAsia="zh-CN"/>
+              </w:rPr>
+            </w:pPr>
+            <w:r>
+              <w:rPr>
+                <w:rFonts w:ascii="楷体" w:eastAsia="楷体" w:hAnsi="楷体"/>
                 <w:b/>
                 <w:bCs/>
                 <w:color w:val="000000"/>
@@ -19399,56 +17082,25 @@
                 <w:szCs w:val="28"/>
                 <w:lang w:eastAsia="zh-CN"/>
               </w:rPr>
-            </w:pPr>
-            <w:r>
-              <w:rPr>
-                <w:rFonts w:eastAsia="楷体" w:hint="eastAsia"/>
-                <w:b/>
-                <w:bCs/>
-                <w:color w:val="000000"/>
-                <w:sz w:val="28"/>
-                <w:szCs w:val="28"/>
-                <w:lang w:eastAsia="zh-CN"/>
-              </w:rPr>
-              <w:t>3</w:t>
-            </w:r>
-            <w:r>
-              <w:rPr>
-                <w:rFonts w:ascii="楷体" w:eastAsia="楷体" w:hAnsi="楷体"/>
-                <w:b/>
-                <w:bCs/>
-                <w:color w:val="000000"/>
-                <w:sz w:val="28"/>
-                <w:szCs w:val="28"/>
-                <w:lang w:eastAsia="zh-CN"/>
-              </w:rPr>
-              <w:t>月</w:t>
-            </w:r>
-            <w:r>
-              <w:rPr>
-                <w:rFonts w:eastAsia="楷体" w:hint="eastAsia"/>
-                <w:b/>
-                <w:bCs/>
-                <w:color w:val="000000"/>
-                <w:sz w:val="28"/>
-                <w:szCs w:val="28"/>
-                <w:lang w:eastAsia="zh-CN"/>
-              </w:rPr>
-              <w:t>1</w:t>
-            </w:r>
-            <w:r>
-              <w:rPr>
-                <w:rFonts w:ascii="楷体" w:eastAsia="楷体" w:hAnsi="楷体"/>
-                <w:b/>
-                <w:bCs/>
-                <w:color w:val="000000"/>
-                <w:sz w:val="28"/>
-                <w:szCs w:val="28"/>
-                <w:lang w:eastAsia="zh-CN"/>
-              </w:rPr>
-              <w:t>日</w:t>
-            </w:r>
-          </w:p>
+              <w:t>聖餐</w:t>
+            </w:r>
+          </w:p>
+        </w:tc>
+        <w:tc>
+          <w:tcPr>
+            <w:tcW w:w="8487" w:type="dxa"/>
+            <w:gridSpan w:val="6"/>
+            <w:tcBorders>
+              <w:top w:val="single" w:sz="8" w:space="0" w:color="000000"/>
+              <w:left w:val="single" w:sz="8" w:space="0" w:color="000000"/>
+              <w:bottom w:val="single" w:sz="8" w:space="0" w:color="000000"/>
+              <w:right w:val="single" w:sz="8" w:space="0" w:color="000000"/>
+              <w:tl2br w:val="nil"/>
+              <w:tr2bl w:val="nil"/>
+            </w:tcBorders>
+            <w:shd w:val="clear" w:color="auto" w:fill="FFFFFF"/>
+            <w:vAlign w:val="center"/>
+          </w:tcPr>
           <w:p>
             <w:pPr>
               <w:spacing w:after="0" w:line="240" w:lineRule="auto"/>
@@ -19461,221 +17113,6 @@
                 <w:lang w:eastAsia="zh-CN"/>
               </w:rPr>
             </w:pPr>
-            <w:r>
-              <w:rPr>
-                <w:rFonts w:ascii="楷体" w:eastAsia="楷体" w:hAnsi="楷体"/>
-                <w:b/>
-                <w:bCs/>
-                <w:color w:val="000000"/>
-                <w:sz w:val="28"/>
-                <w:szCs w:val="28"/>
-                <w:lang w:eastAsia="zh-CN"/>
-              </w:rPr>
-              <w:t>聖餐</w:t>
-            </w:r>
-          </w:p>
-        </w:tc>
-        <w:tc>
-          <w:tcPr>
-            <w:tcW w:w="8487" w:type="dxa"/>
-            <w:gridSpan w:val="6"/>
-            <w:tcBorders>
-              <w:top w:val="single" w:sz="8" w:space="0" w:color="000000"/>
-              <w:left w:val="single" w:sz="8" w:space="0" w:color="000000"/>
-              <w:bottom w:val="single" w:sz="8" w:space="0" w:color="000000"/>
-              <w:right w:val="single" w:sz="8" w:space="0" w:color="000000"/>
-              <w:tl2br w:val="nil"/>
-              <w:tr2bl w:val="nil"/>
-            </w:tcBorders>
-            <w:shd w:val="clear" w:color="auto" w:fill="FFFFFF"/>
-            <w:vAlign w:val="center"/>
-          </w:tcPr>
-          <w:p>
-            <w:pPr>
-              <w:spacing w:after="0" w:line="240" w:lineRule="auto"/>
-              <w:jc w:val="center"/>
-              <w:rPr>
-                <w:rFonts w:ascii="楷体" w:eastAsia="楷体" w:hAnsi="楷体" w:cs="微软雅黑"/>
-                <w:spacing w:val="-8"/>
-                <w:sz w:val="28"/>
-                <w:szCs w:val="28"/>
-                <w:lang w:eastAsia="zh-CN"/>
-              </w:rPr>
-            </w:pPr>
-            <w:r>
-              <w:rPr>
-                <w:rFonts w:ascii="楷体" w:eastAsia="楷体" w:hAnsi="楷体" w:cs="楷体" w:hint="eastAsia"/>
-                <w:color w:val="000000"/>
-                <w:sz w:val="28"/>
-                <w:szCs w:val="28"/>
-                <w:lang w:eastAsia="zh-TW"/>
-              </w:rPr>
-              <w:t>第一組：</w:t>
-            </w:r>
-            <w:r>
-              <w:rPr>
-                <w:rFonts w:ascii="楷体" w:eastAsia="楷体" w:hAnsi="楷体" w:cs="微软雅黑" w:hint="eastAsia"/>
-                <w:spacing w:val="-3"/>
-                <w:sz w:val="28"/>
-                <w:szCs w:val="28"/>
-                <w:lang w:eastAsia="zh-CN"/>
-              </w:rPr>
-              <w:t>鍾學謙</w:t>
-            </w:r>
-            <w:r>
-              <w:rPr>
-                <w:rFonts w:ascii="楷体" w:eastAsia="楷体" w:hAnsi="楷体" w:hint="eastAsia"/>
-                <w:color w:val="000000"/>
-                <w:sz w:val="28"/>
-                <w:szCs w:val="28"/>
-                <w:lang w:eastAsia="zh-CN"/>
-              </w:rPr>
-              <w:t>,</w:t>
-            </w:r>
-            <w:r>
-              <w:rPr>
-                <w:rFonts w:ascii="楷体" w:eastAsia="楷体" w:hAnsi="楷体" w:cs="微软雅黑" w:hint="eastAsia"/>
-                <w:spacing w:val="-8"/>
-                <w:sz w:val="28"/>
-                <w:szCs w:val="28"/>
-                <w:lang w:eastAsia="zh-CN"/>
-              </w:rPr>
-              <w:t xml:space="preserve"> 龔</w:t>
-            </w:r>
-            <w:r>
-              <w:rPr>
-                <w:rFonts w:ascii="楷体" w:eastAsia="楷体" w:hAnsi="楷体" w:hint="eastAsia"/>
-                <w:color w:val="000000"/>
-                <w:sz w:val="28"/>
-                <w:szCs w:val="28"/>
-                <w:lang w:eastAsia="zh-CN"/>
-              </w:rPr>
-              <w:t>師母</w:t>
-            </w:r>
-          </w:p>
-          <w:p>
-            <w:pPr>
-              <w:spacing w:after="0" w:line="240" w:lineRule="auto"/>
-              <w:ind w:firstLineChars="900" w:firstLine="2520"/>
-              <w:rPr>
-                <w:rFonts w:ascii="楷体" w:eastAsia="楷体" w:hAnsi="楷体" w:cs="楷体"/>
-                <w:color w:val="000000"/>
-                <w:sz w:val="28"/>
-                <w:szCs w:val="28"/>
-                <w:lang w:eastAsia="zh-CN"/>
-              </w:rPr>
-            </w:pPr>
-            <w:r>
-              <w:rPr>
-                <w:rFonts w:ascii="楷体" w:eastAsia="楷体" w:hAnsi="楷体" w:cs="楷体" w:hint="eastAsia"/>
-                <w:color w:val="000000"/>
-                <w:sz w:val="28"/>
-                <w:szCs w:val="28"/>
-                <w:lang w:eastAsia="zh-TW"/>
-              </w:rPr>
-              <w:t>第二組：</w:t>
-            </w:r>
-            <w:r>
-              <w:rPr>
-                <w:rFonts w:ascii="楷体" w:eastAsia="楷体" w:hAnsi="楷体" w:cs="宋体" w:hint="eastAsia"/>
-                <w:sz w:val="28"/>
-                <w:szCs w:val="28"/>
-                <w:lang w:eastAsia="zh-TW"/>
-              </w:rPr>
-              <w:t>黄建嘉</w:t>
-            </w:r>
-            <w:r>
-              <w:rPr>
-                <w:rFonts w:ascii="楷体" w:eastAsia="楷体" w:hAnsi="楷体" w:cs="宋体" w:hint="eastAsia"/>
-                <w:sz w:val="28"/>
-                <w:szCs w:val="28"/>
-                <w:lang w:eastAsia="zh-CN"/>
-              </w:rPr>
-              <w:t>,</w:t>
-            </w:r>
-            <w:r>
-              <w:rPr>
-                <w:rFonts w:ascii="楷体" w:eastAsia="楷体" w:hAnsi="楷体" w:hint="eastAsia"/>
-                <w:color w:val="000000"/>
-                <w:sz w:val="28"/>
-                <w:szCs w:val="28"/>
-                <w:lang w:eastAsia="zh-CN"/>
-              </w:rPr>
-              <w:t xml:space="preserve"> </w:t>
-            </w:r>
-            <w:r>
-              <w:rPr>
-                <w:rFonts w:ascii="楷体" w:eastAsia="楷体" w:hAnsi="楷体" w:cs="微软雅黑" w:hint="eastAsia"/>
-                <w:spacing w:val="-8"/>
-                <w:sz w:val="28"/>
-                <w:szCs w:val="28"/>
-                <w:lang w:eastAsia="zh-CN"/>
-              </w:rPr>
-              <w:t>黃怡瑄</w:t>
-            </w:r>
-          </w:p>
-          <w:p>
-            <w:pPr>
-              <w:spacing w:after="0" w:line="240" w:lineRule="auto"/>
-              <w:jc w:val="center"/>
-              <w:rPr>
-                <w:rFonts w:ascii="楷体" w:eastAsia="楷体" w:hAnsi="楷体"/>
-                <w:color w:val="000000"/>
-                <w:sz w:val="28"/>
-                <w:szCs w:val="28"/>
-                <w:lang w:eastAsia="zh-CN"/>
-              </w:rPr>
-            </w:pPr>
-            <w:r>
-              <w:rPr>
-                <w:rFonts w:ascii="楷体" w:eastAsia="楷体" w:hAnsi="楷体" w:cs="楷体" w:hint="eastAsia"/>
-                <w:color w:val="000000"/>
-                <w:sz w:val="28"/>
-                <w:szCs w:val="28"/>
-                <w:lang w:eastAsia="zh-TW"/>
-              </w:rPr>
-              <w:t>第三組：</w:t>
-            </w:r>
-            <w:r>
-              <w:rPr>
-                <w:rFonts w:ascii="楷体" w:eastAsia="楷体" w:hAnsi="楷体" w:cs="楷体" w:hint="eastAsia"/>
-                <w:color w:val="000000"/>
-                <w:sz w:val="28"/>
-                <w:szCs w:val="28"/>
-                <w:lang w:eastAsia="zh-TW"/>
-              </w:rPr>
-              <w:t>謝</w:t>
-            </w:r>
-            <w:r>
-              <w:rPr>
-                <w:rFonts w:ascii="楷体" w:eastAsia="楷体" w:hAnsi="楷体" w:cs="楷体" w:hint="eastAsia"/>
-                <w:color w:val="000000"/>
-                <w:sz w:val="28"/>
-                <w:szCs w:val="28"/>
-                <w:lang w:eastAsia="zh-TW"/>
-              </w:rPr>
-              <w:t>定康，</w:t>
-            </w:r>
-            <w:r>
-              <w:rPr>
-                <w:rFonts w:ascii="楷体" w:eastAsia="楷体" w:hAnsi="楷体" w:cs="楷体" w:hint="eastAsia"/>
-                <w:color w:val="000000"/>
-                <w:sz w:val="28"/>
-                <w:szCs w:val="28"/>
-                <w:lang w:eastAsia="zh-TW"/>
-              </w:rPr>
-              <w:t>陳</w:t>
-            </w:r>
-            <w:r>
-              <w:rPr>
-                <w:rFonts w:ascii="楷体" w:eastAsia="楷体" w:hAnsi="楷体" w:cs="楷体" w:hint="eastAsia"/>
-                <w:color w:val="000000"/>
-                <w:sz w:val="28"/>
-                <w:szCs w:val="28"/>
-                <w:lang w:eastAsia="zh-TW"/>
-              </w:rPr>
-              <w:t>聆燕</w:t>
-            </w:r>
           </w:p>
         </w:tc>
       </w:tr>
@@ -20734,7 +18171,6 @@
   <w:style w:type="character" w:default="1" w:styleId="a0">
     <w:name w:val="Default Paragraph Font"/>
     <w:uiPriority w:val="1"/>
-    <w:semiHidden/>
     <w:unhideWhenUsed/>
   </w:style>
   <w:style w:type="table" w:default="1" w:styleId="a1">

</xml_diff>